<commit_message>
finished TDD and Research Report and added  more comments to code
</commit_message>
<xml_diff>
--- a/Technical Design Document.docx
+++ b/Technical Design Document.docx
@@ -274,8 +274,18 @@
     </w:p>
     <w:sdt>
       <w:sdtPr>
+        <w:id w:val="-979755347"/>
+        <w:docPartObj>
+          <w:docPartGallery w:val="Table of Contents"/>
+          <w:docPartUnique/>
+        </w:docPartObj>
+      </w:sdtPr>
+      <w:sdtEndPr>
         <w:rPr>
           <w:rFonts w:asciiTheme="minorHAnsi" w:eastAsiaTheme="minorHAnsi" w:hAnsiTheme="minorHAnsi" w:cstheme="minorBidi"/>
+          <w:b/>
+          <w:bCs/>
+          <w:noProof/>
           <w:color w:val="auto"/>
           <w:kern w:val="2"/>
           <w:sz w:val="22"/>
@@ -283,25 +293,19 @@
           <w:lang w:val="en-GB"/>
           <w14:ligatures w14:val="standardContextual"/>
         </w:rPr>
-        <w:id w:val="1649944363"/>
-        <w:docPartObj>
-          <w:docPartGallery w:val="Table of Contents"/>
-          <w:docPartUnique/>
-        </w:docPartObj>
-      </w:sdtPr>
-      <w:sdtEndPr>
-        <w:rPr>
-          <w:b/>
-          <w:bCs/>
-          <w:noProof/>
-        </w:rPr>
       </w:sdtEndPr>
       <w:sdtContent>
         <w:p>
           <w:pPr>
             <w:pStyle w:val="TOCHeading"/>
+            <w:rPr>
+              <w:rFonts w:ascii="Times New Roman" w:hAnsi="Times New Roman" w:cs="Times New Roman"/>
+            </w:rPr>
           </w:pPr>
           <w:r>
+            <w:rPr>
+              <w:rFonts w:ascii="Times New Roman" w:hAnsi="Times New Roman" w:cs="Times New Roman"/>
+            </w:rPr>
             <w:t>Contents</w:t>
           </w:r>
         </w:p>
@@ -312,29 +316,123 @@
               <w:tab w:val="right" w:leader="dot" w:pos="9016"/>
             </w:tabs>
             <w:rPr>
+              <w:rFonts w:ascii="Times New Roman" w:eastAsiaTheme="minorEastAsia" w:hAnsi="Times New Roman" w:cs="Times New Roman"/>
               <w:noProof/>
+              <w:sz w:val="24"/>
+              <w:szCs w:val="24"/>
+              <w:lang w:eastAsia="en-GB"/>
             </w:rPr>
           </w:pPr>
           <w:r>
+            <w:rPr>
+              <w:rFonts w:ascii="Times New Roman" w:hAnsi="Times New Roman" w:cs="Times New Roman"/>
+            </w:rPr>
             <w:fldChar w:fldCharType="begin"/>
           </w:r>
           <w:r>
+            <w:rPr>
+              <w:rFonts w:ascii="Times New Roman" w:hAnsi="Times New Roman" w:cs="Times New Roman"/>
+            </w:rPr>
             <w:instrText xml:space="preserve"> TOC \o "1-3" \h \z \u </w:instrText>
           </w:r>
           <w:r>
+            <w:rPr>
+              <w:rFonts w:ascii="Times New Roman" w:hAnsi="Times New Roman" w:cs="Times New Roman"/>
+            </w:rPr>
             <w:fldChar w:fldCharType="separate"/>
           </w:r>
-          <w:hyperlink w:anchor="_Toc226741962" w:history="1">
+          <w:hyperlink w:anchor="_Toc226834686" w:history="1">
             <w:r>
               <w:rPr>
                 <w:rStyle w:val="Hyperlink"/>
                 <w:rFonts w:ascii="Times New Roman" w:hAnsi="Times New Roman" w:cs="Times New Roman"/>
                 <w:noProof/>
               </w:rPr>
+              <w:t>Project Overview</w:t>
+            </w:r>
+            <w:r>
+              <w:rPr>
+                <w:rFonts w:ascii="Times New Roman" w:hAnsi="Times New Roman" w:cs="Times New Roman"/>
+                <w:noProof/>
+                <w:webHidden/>
+              </w:rPr>
+              <w:tab/>
+            </w:r>
+            <w:r>
+              <w:rPr>
+                <w:rFonts w:ascii="Times New Roman" w:hAnsi="Times New Roman" w:cs="Times New Roman"/>
+                <w:noProof/>
+                <w:webHidden/>
+              </w:rPr>
+              <w:fldChar w:fldCharType="begin"/>
+            </w:r>
+            <w:r>
+              <w:rPr>
+                <w:rFonts w:ascii="Times New Roman" w:hAnsi="Times New Roman" w:cs="Times New Roman"/>
+                <w:noProof/>
+                <w:webHidden/>
+              </w:rPr>
+              <w:instrText xml:space="preserve"> PAGEREF _Toc226834686 \h </w:instrText>
+            </w:r>
+            <w:r>
+              <w:rPr>
+                <w:rFonts w:ascii="Times New Roman" w:hAnsi="Times New Roman" w:cs="Times New Roman"/>
+                <w:noProof/>
+                <w:webHidden/>
+              </w:rPr>
+            </w:r>
+            <w:r>
+              <w:rPr>
+                <w:rFonts w:ascii="Times New Roman" w:hAnsi="Times New Roman" w:cs="Times New Roman"/>
+                <w:noProof/>
+                <w:webHidden/>
+              </w:rPr>
+              <w:fldChar w:fldCharType="separate"/>
+            </w:r>
+            <w:r>
+              <w:rPr>
+                <w:rFonts w:ascii="Times New Roman" w:hAnsi="Times New Roman" w:cs="Times New Roman"/>
+                <w:noProof/>
+                <w:webHidden/>
+              </w:rPr>
+              <w:t>3</w:t>
+            </w:r>
+            <w:r>
+              <w:rPr>
+                <w:rFonts w:ascii="Times New Roman" w:hAnsi="Times New Roman" w:cs="Times New Roman"/>
+                <w:noProof/>
+                <w:webHidden/>
+              </w:rPr>
+              <w:fldChar w:fldCharType="end"/>
+            </w:r>
+          </w:hyperlink>
+        </w:p>
+        <w:p>
+          <w:pPr>
+            <w:pStyle w:val="TOC1"/>
+            <w:tabs>
+              <w:tab w:val="right" w:leader="dot" w:pos="9016"/>
+            </w:tabs>
+            <w:rPr>
+              <w:rFonts w:ascii="Times New Roman" w:eastAsiaTheme="minorEastAsia" w:hAnsi="Times New Roman" w:cs="Times New Roman"/>
+              <w:noProof/>
+              <w:sz w:val="24"/>
+              <w:szCs w:val="24"/>
+              <w:lang w:eastAsia="en-GB"/>
+            </w:rPr>
+          </w:pPr>
+          <w:hyperlink w:anchor="_Toc226834687" w:history="1">
+            <w:r>
+              <w:rPr>
+                <w:rStyle w:val="Hyperlink"/>
+                <w:rFonts w:ascii="Times New Roman" w:hAnsi="Times New Roman" w:cs="Times New Roman"/>
+                <w:noProof/>
+              </w:rPr>
               <w:t>Technical Design</w:t>
             </w:r>
             <w:r>
               <w:rPr>
+                <w:rFonts w:ascii="Times New Roman" w:hAnsi="Times New Roman" w:cs="Times New Roman"/>
                 <w:noProof/>
                 <w:webHidden/>
               </w:rPr>
@@ -342,6 +440,7 @@
             </w:r>
             <w:r>
               <w:rPr>
+                <w:rFonts w:ascii="Times New Roman" w:hAnsi="Times New Roman" w:cs="Times New Roman"/>
                 <w:noProof/>
                 <w:webHidden/>
               </w:rPr>
@@ -349,19 +448,22 @@
             </w:r>
             <w:r>
               <w:rPr>
-                <w:noProof/>
-                <w:webHidden/>
-              </w:rPr>
-              <w:instrText xml:space="preserve"> PAGEREF _Toc226741962 \h </w:instrText>
-            </w:r>
-            <w:r>
-              <w:rPr>
-                <w:noProof/>
-                <w:webHidden/>
-              </w:rPr>
-            </w:r>
-            <w:r>
-              <w:rPr>
+                <w:rFonts w:ascii="Times New Roman" w:hAnsi="Times New Roman" w:cs="Times New Roman"/>
+                <w:noProof/>
+                <w:webHidden/>
+              </w:rPr>
+              <w:instrText xml:space="preserve"> PAGEREF _Toc226834687 \h </w:instrText>
+            </w:r>
+            <w:r>
+              <w:rPr>
+                <w:rFonts w:ascii="Times New Roman" w:hAnsi="Times New Roman" w:cs="Times New Roman"/>
+                <w:noProof/>
+                <w:webHidden/>
+              </w:rPr>
+            </w:r>
+            <w:r>
+              <w:rPr>
+                <w:rFonts w:ascii="Times New Roman" w:hAnsi="Times New Roman" w:cs="Times New Roman"/>
                 <w:noProof/>
                 <w:webHidden/>
               </w:rPr>
@@ -369,6 +471,7 @@
             </w:r>
             <w:r>
               <w:rPr>
+                <w:rFonts w:ascii="Times New Roman" w:hAnsi="Times New Roman" w:cs="Times New Roman"/>
                 <w:noProof/>
                 <w:webHidden/>
               </w:rPr>
@@ -376,6 +479,7 @@
             </w:r>
             <w:r>
               <w:rPr>
+                <w:rFonts w:ascii="Times New Roman" w:hAnsi="Times New Roman" w:cs="Times New Roman"/>
                 <w:noProof/>
                 <w:webHidden/>
               </w:rPr>
@@ -390,10 +494,14 @@
               <w:tab w:val="right" w:leader="dot" w:pos="9016"/>
             </w:tabs>
             <w:rPr>
+              <w:rFonts w:ascii="Times New Roman" w:eastAsiaTheme="minorEastAsia" w:hAnsi="Times New Roman" w:cs="Times New Roman"/>
               <w:noProof/>
+              <w:sz w:val="24"/>
+              <w:szCs w:val="24"/>
+              <w:lang w:eastAsia="en-GB"/>
             </w:rPr>
           </w:pPr>
-          <w:hyperlink w:anchor="_Toc226741963" w:history="1">
+          <w:hyperlink w:anchor="_Toc226834688" w:history="1">
             <w:r>
               <w:rPr>
                 <w:rStyle w:val="Hyperlink"/>
@@ -404,6 +512,7 @@
             </w:r>
             <w:r>
               <w:rPr>
+                <w:rFonts w:ascii="Times New Roman" w:hAnsi="Times New Roman" w:cs="Times New Roman"/>
                 <w:noProof/>
                 <w:webHidden/>
               </w:rPr>
@@ -411,6 +520,7 @@
             </w:r>
             <w:r>
               <w:rPr>
+                <w:rFonts w:ascii="Times New Roman" w:hAnsi="Times New Roman" w:cs="Times New Roman"/>
                 <w:noProof/>
                 <w:webHidden/>
               </w:rPr>
@@ -418,19 +528,22 @@
             </w:r>
             <w:r>
               <w:rPr>
-                <w:noProof/>
-                <w:webHidden/>
-              </w:rPr>
-              <w:instrText xml:space="preserve"> PAGEREF _Toc226741963 \h </w:instrText>
-            </w:r>
-            <w:r>
-              <w:rPr>
-                <w:noProof/>
-                <w:webHidden/>
-              </w:rPr>
-            </w:r>
-            <w:r>
-              <w:rPr>
+                <w:rFonts w:ascii="Times New Roman" w:hAnsi="Times New Roman" w:cs="Times New Roman"/>
+                <w:noProof/>
+                <w:webHidden/>
+              </w:rPr>
+              <w:instrText xml:space="preserve"> PAGEREF _Toc226834688 \h </w:instrText>
+            </w:r>
+            <w:r>
+              <w:rPr>
+                <w:rFonts w:ascii="Times New Roman" w:hAnsi="Times New Roman" w:cs="Times New Roman"/>
+                <w:noProof/>
+                <w:webHidden/>
+              </w:rPr>
+            </w:r>
+            <w:r>
+              <w:rPr>
+                <w:rFonts w:ascii="Times New Roman" w:hAnsi="Times New Roman" w:cs="Times New Roman"/>
                 <w:noProof/>
                 <w:webHidden/>
               </w:rPr>
@@ -438,6 +551,7 @@
             </w:r>
             <w:r>
               <w:rPr>
+                <w:rFonts w:ascii="Times New Roman" w:hAnsi="Times New Roman" w:cs="Times New Roman"/>
                 <w:noProof/>
                 <w:webHidden/>
               </w:rPr>
@@ -445,6 +559,7 @@
             </w:r>
             <w:r>
               <w:rPr>
+                <w:rFonts w:ascii="Times New Roman" w:hAnsi="Times New Roman" w:cs="Times New Roman"/>
                 <w:noProof/>
                 <w:webHidden/>
               </w:rPr>
@@ -459,20 +574,102 @@
               <w:tab w:val="right" w:leader="dot" w:pos="9016"/>
             </w:tabs>
             <w:rPr>
+              <w:rFonts w:ascii="Times New Roman" w:eastAsiaTheme="minorEastAsia" w:hAnsi="Times New Roman" w:cs="Times New Roman"/>
+              <w:noProof/>
+              <w:sz w:val="24"/>
+              <w:szCs w:val="24"/>
+              <w:lang w:eastAsia="en-GB"/>
+            </w:rPr>
+          </w:pPr>
+          <w:hyperlink w:anchor="_Toc226834689" w:history="1">
+            <w:r>
+              <w:rPr>
+                <w:rStyle w:val="Hyperlink"/>
+                <w:rFonts w:ascii="Times New Roman" w:hAnsi="Times New Roman" w:cs="Times New Roman"/>
+                <w:noProof/>
+              </w:rPr>
+              <w:t>Player</w:t>
+            </w:r>
+            <w:r>
+              <w:rPr>
+                <w:rFonts w:ascii="Times New Roman" w:hAnsi="Times New Roman" w:cs="Times New Roman"/>
+                <w:noProof/>
+                <w:webHidden/>
+              </w:rPr>
+              <w:tab/>
+            </w:r>
+            <w:r>
+              <w:rPr>
+                <w:rFonts w:ascii="Times New Roman" w:hAnsi="Times New Roman" w:cs="Times New Roman"/>
+                <w:noProof/>
+                <w:webHidden/>
+              </w:rPr>
+              <w:fldChar w:fldCharType="begin"/>
+            </w:r>
+            <w:r>
+              <w:rPr>
+                <w:rFonts w:ascii="Times New Roman" w:hAnsi="Times New Roman" w:cs="Times New Roman"/>
+                <w:noProof/>
+                <w:webHidden/>
+              </w:rPr>
+              <w:instrText xml:space="preserve"> PAGEREF _Toc226834689 \h </w:instrText>
+            </w:r>
+            <w:r>
+              <w:rPr>
+                <w:rFonts w:ascii="Times New Roman" w:hAnsi="Times New Roman" w:cs="Times New Roman"/>
+                <w:noProof/>
+                <w:webHidden/>
+              </w:rPr>
+            </w:r>
+            <w:r>
+              <w:rPr>
+                <w:rFonts w:ascii="Times New Roman" w:hAnsi="Times New Roman" w:cs="Times New Roman"/>
+                <w:noProof/>
+                <w:webHidden/>
+              </w:rPr>
+              <w:fldChar w:fldCharType="separate"/>
+            </w:r>
+            <w:r>
+              <w:rPr>
+                <w:rFonts w:ascii="Times New Roman" w:hAnsi="Times New Roman" w:cs="Times New Roman"/>
+                <w:noProof/>
+                <w:webHidden/>
+              </w:rPr>
+              <w:t>4</w:t>
+            </w:r>
+            <w:r>
+              <w:rPr>
+                <w:rFonts w:ascii="Times New Roman" w:hAnsi="Times New Roman" w:cs="Times New Roman"/>
+                <w:noProof/>
+                <w:webHidden/>
+              </w:rPr>
+              <w:fldChar w:fldCharType="end"/>
+            </w:r>
+          </w:hyperlink>
+        </w:p>
+        <w:p>
+          <w:pPr>
+            <w:pStyle w:val="TOC3"/>
+            <w:tabs>
+              <w:tab w:val="right" w:leader="dot" w:pos="9016"/>
+            </w:tabs>
+            <w:rPr>
+              <w:rFonts w:ascii="Times New Roman" w:hAnsi="Times New Roman" w:cs="Times New Roman"/>
               <w:noProof/>
             </w:rPr>
           </w:pPr>
-          <w:hyperlink w:anchor="_Toc226741964" w:history="1">
+          <w:hyperlink w:anchor="_Toc226834690" w:history="1">
             <w:r>
               <w:rPr>
                 <w:rStyle w:val="Hyperlink"/>
                 <w:rFonts w:ascii="Times New Roman" w:hAnsi="Times New Roman" w:cs="Times New Roman"/>
                 <w:noProof/>
               </w:rPr>
-              <w:t>Player</w:t>
-            </w:r>
-            <w:r>
-              <w:rPr>
+              <w:t>Input Handling</w:t>
+            </w:r>
+            <w:r>
+              <w:rPr>
+                <w:rFonts w:ascii="Times New Roman" w:hAnsi="Times New Roman" w:cs="Times New Roman"/>
                 <w:noProof/>
                 <w:webHidden/>
               </w:rPr>
@@ -480,6 +677,7 @@
             </w:r>
             <w:r>
               <w:rPr>
+                <w:rFonts w:ascii="Times New Roman" w:hAnsi="Times New Roman" w:cs="Times New Roman"/>
                 <w:noProof/>
                 <w:webHidden/>
               </w:rPr>
@@ -487,19 +685,22 @@
             </w:r>
             <w:r>
               <w:rPr>
-                <w:noProof/>
-                <w:webHidden/>
-              </w:rPr>
-              <w:instrText xml:space="preserve"> PAGEREF _Toc226741964 \h </w:instrText>
-            </w:r>
-            <w:r>
-              <w:rPr>
-                <w:noProof/>
-                <w:webHidden/>
-              </w:rPr>
-            </w:r>
-            <w:r>
-              <w:rPr>
+                <w:rFonts w:ascii="Times New Roman" w:hAnsi="Times New Roman" w:cs="Times New Roman"/>
+                <w:noProof/>
+                <w:webHidden/>
+              </w:rPr>
+              <w:instrText xml:space="preserve"> PAGEREF _Toc226834690 \h </w:instrText>
+            </w:r>
+            <w:r>
+              <w:rPr>
+                <w:rFonts w:ascii="Times New Roman" w:hAnsi="Times New Roman" w:cs="Times New Roman"/>
+                <w:noProof/>
+                <w:webHidden/>
+              </w:rPr>
+            </w:r>
+            <w:r>
+              <w:rPr>
+                <w:rFonts w:ascii="Times New Roman" w:hAnsi="Times New Roman" w:cs="Times New Roman"/>
                 <w:noProof/>
                 <w:webHidden/>
               </w:rPr>
@@ -507,13 +708,169 @@
             </w:r>
             <w:r>
               <w:rPr>
-                <w:noProof/>
-                <w:webHidden/>
-              </w:rPr>
-              <w:t>3</w:t>
-            </w:r>
-            <w:r>
-              <w:rPr>
+                <w:rFonts w:ascii="Times New Roman" w:hAnsi="Times New Roman" w:cs="Times New Roman"/>
+                <w:noProof/>
+                <w:webHidden/>
+              </w:rPr>
+              <w:t>4</w:t>
+            </w:r>
+            <w:r>
+              <w:rPr>
+                <w:rFonts w:ascii="Times New Roman" w:hAnsi="Times New Roman" w:cs="Times New Roman"/>
+                <w:noProof/>
+                <w:webHidden/>
+              </w:rPr>
+              <w:fldChar w:fldCharType="end"/>
+            </w:r>
+          </w:hyperlink>
+        </w:p>
+        <w:p>
+          <w:pPr>
+            <w:pStyle w:val="TOC3"/>
+            <w:tabs>
+              <w:tab w:val="right" w:leader="dot" w:pos="9016"/>
+            </w:tabs>
+            <w:rPr>
+              <w:rFonts w:ascii="Times New Roman" w:hAnsi="Times New Roman" w:cs="Times New Roman"/>
+              <w:noProof/>
+            </w:rPr>
+          </w:pPr>
+          <w:hyperlink w:anchor="_Toc226834691" w:history="1">
+            <w:r>
+              <w:rPr>
+                <w:rStyle w:val="Hyperlink"/>
+                <w:rFonts w:ascii="Times New Roman" w:hAnsi="Times New Roman" w:cs="Times New Roman"/>
+                <w:noProof/>
+              </w:rPr>
+              <w:t>Facing Direction</w:t>
+            </w:r>
+            <w:r>
+              <w:rPr>
+                <w:rFonts w:ascii="Times New Roman" w:hAnsi="Times New Roman" w:cs="Times New Roman"/>
+                <w:noProof/>
+                <w:webHidden/>
+              </w:rPr>
+              <w:tab/>
+            </w:r>
+            <w:r>
+              <w:rPr>
+                <w:rFonts w:ascii="Times New Roman" w:hAnsi="Times New Roman" w:cs="Times New Roman"/>
+                <w:noProof/>
+                <w:webHidden/>
+              </w:rPr>
+              <w:fldChar w:fldCharType="begin"/>
+            </w:r>
+            <w:r>
+              <w:rPr>
+                <w:rFonts w:ascii="Times New Roman" w:hAnsi="Times New Roman" w:cs="Times New Roman"/>
+                <w:noProof/>
+                <w:webHidden/>
+              </w:rPr>
+              <w:instrText xml:space="preserve"> PAGEREF _Toc226834691 \h </w:instrText>
+            </w:r>
+            <w:r>
+              <w:rPr>
+                <w:rFonts w:ascii="Times New Roman" w:hAnsi="Times New Roman" w:cs="Times New Roman"/>
+                <w:noProof/>
+                <w:webHidden/>
+              </w:rPr>
+            </w:r>
+            <w:r>
+              <w:rPr>
+                <w:rFonts w:ascii="Times New Roman" w:hAnsi="Times New Roman" w:cs="Times New Roman"/>
+                <w:noProof/>
+                <w:webHidden/>
+              </w:rPr>
+              <w:fldChar w:fldCharType="separate"/>
+            </w:r>
+            <w:r>
+              <w:rPr>
+                <w:rFonts w:ascii="Times New Roman" w:hAnsi="Times New Roman" w:cs="Times New Roman"/>
+                <w:noProof/>
+                <w:webHidden/>
+              </w:rPr>
+              <w:t>4</w:t>
+            </w:r>
+            <w:r>
+              <w:rPr>
+                <w:rFonts w:ascii="Times New Roman" w:hAnsi="Times New Roman" w:cs="Times New Roman"/>
+                <w:noProof/>
+                <w:webHidden/>
+              </w:rPr>
+              <w:fldChar w:fldCharType="end"/>
+            </w:r>
+          </w:hyperlink>
+        </w:p>
+        <w:p>
+          <w:pPr>
+            <w:pStyle w:val="TOC3"/>
+            <w:tabs>
+              <w:tab w:val="right" w:leader="dot" w:pos="9016"/>
+            </w:tabs>
+            <w:rPr>
+              <w:rFonts w:ascii="Times New Roman" w:hAnsi="Times New Roman" w:cs="Times New Roman"/>
+              <w:noProof/>
+            </w:rPr>
+          </w:pPr>
+          <w:hyperlink w:anchor="_Toc226834692" w:history="1">
+            <w:r>
+              <w:rPr>
+                <w:rStyle w:val="Hyperlink"/>
+                <w:rFonts w:ascii="Times New Roman" w:hAnsi="Times New Roman" w:cs="Times New Roman"/>
+                <w:noProof/>
+              </w:rPr>
+              <w:t>Positioning</w:t>
+            </w:r>
+            <w:r>
+              <w:rPr>
+                <w:rFonts w:ascii="Times New Roman" w:hAnsi="Times New Roman" w:cs="Times New Roman"/>
+                <w:noProof/>
+                <w:webHidden/>
+              </w:rPr>
+              <w:tab/>
+            </w:r>
+            <w:r>
+              <w:rPr>
+                <w:rFonts w:ascii="Times New Roman" w:hAnsi="Times New Roman" w:cs="Times New Roman"/>
+                <w:noProof/>
+                <w:webHidden/>
+              </w:rPr>
+              <w:fldChar w:fldCharType="begin"/>
+            </w:r>
+            <w:r>
+              <w:rPr>
+                <w:rFonts w:ascii="Times New Roman" w:hAnsi="Times New Roman" w:cs="Times New Roman"/>
+                <w:noProof/>
+                <w:webHidden/>
+              </w:rPr>
+              <w:instrText xml:space="preserve"> PAGEREF _Toc226834692 \h </w:instrText>
+            </w:r>
+            <w:r>
+              <w:rPr>
+                <w:rFonts w:ascii="Times New Roman" w:hAnsi="Times New Roman" w:cs="Times New Roman"/>
+                <w:noProof/>
+                <w:webHidden/>
+              </w:rPr>
+            </w:r>
+            <w:r>
+              <w:rPr>
+                <w:rFonts w:ascii="Times New Roman" w:hAnsi="Times New Roman" w:cs="Times New Roman"/>
+                <w:noProof/>
+                <w:webHidden/>
+              </w:rPr>
+              <w:fldChar w:fldCharType="separate"/>
+            </w:r>
+            <w:r>
+              <w:rPr>
+                <w:rFonts w:ascii="Times New Roman" w:hAnsi="Times New Roman" w:cs="Times New Roman"/>
+                <w:noProof/>
+                <w:webHidden/>
+              </w:rPr>
+              <w:t>4</w:t>
+            </w:r>
+            <w:r>
+              <w:rPr>
+                <w:rFonts w:ascii="Times New Roman" w:hAnsi="Times New Roman" w:cs="Times New Roman"/>
                 <w:noProof/>
                 <w:webHidden/>
               </w:rPr>
@@ -528,19 +885,102 @@
               <w:tab w:val="right" w:leader="dot" w:pos="9016"/>
             </w:tabs>
             <w:rPr>
+              <w:rFonts w:ascii="Times New Roman" w:eastAsiaTheme="minorEastAsia" w:hAnsi="Times New Roman" w:cs="Times New Roman"/>
+              <w:noProof/>
+              <w:sz w:val="24"/>
+              <w:szCs w:val="24"/>
+              <w:lang w:eastAsia="en-GB"/>
+            </w:rPr>
+          </w:pPr>
+          <w:hyperlink w:anchor="_Toc226834693" w:history="1">
+            <w:r>
+              <w:rPr>
+                <w:rStyle w:val="Hyperlink"/>
+                <w:rFonts w:ascii="Times New Roman" w:hAnsi="Times New Roman" w:cs="Times New Roman"/>
+                <w:noProof/>
+              </w:rPr>
+              <w:t>Enemy</w:t>
+            </w:r>
+            <w:r>
+              <w:rPr>
+                <w:rFonts w:ascii="Times New Roman" w:hAnsi="Times New Roman" w:cs="Times New Roman"/>
+                <w:noProof/>
+                <w:webHidden/>
+              </w:rPr>
+              <w:tab/>
+            </w:r>
+            <w:r>
+              <w:rPr>
+                <w:rFonts w:ascii="Times New Roman" w:hAnsi="Times New Roman" w:cs="Times New Roman"/>
+                <w:noProof/>
+                <w:webHidden/>
+              </w:rPr>
+              <w:fldChar w:fldCharType="begin"/>
+            </w:r>
+            <w:r>
+              <w:rPr>
+                <w:rFonts w:ascii="Times New Roman" w:hAnsi="Times New Roman" w:cs="Times New Roman"/>
+                <w:noProof/>
+                <w:webHidden/>
+              </w:rPr>
+              <w:instrText xml:space="preserve"> PAGEREF _Toc226834693 \h </w:instrText>
+            </w:r>
+            <w:r>
+              <w:rPr>
+                <w:rFonts w:ascii="Times New Roman" w:hAnsi="Times New Roman" w:cs="Times New Roman"/>
+                <w:noProof/>
+                <w:webHidden/>
+              </w:rPr>
+            </w:r>
+            <w:r>
+              <w:rPr>
+                <w:rFonts w:ascii="Times New Roman" w:hAnsi="Times New Roman" w:cs="Times New Roman"/>
+                <w:noProof/>
+                <w:webHidden/>
+              </w:rPr>
+              <w:fldChar w:fldCharType="separate"/>
+            </w:r>
+            <w:r>
+              <w:rPr>
+                <w:rFonts w:ascii="Times New Roman" w:hAnsi="Times New Roman" w:cs="Times New Roman"/>
+                <w:noProof/>
+                <w:webHidden/>
+              </w:rPr>
+              <w:t>5</w:t>
+            </w:r>
+            <w:r>
+              <w:rPr>
+                <w:rFonts w:ascii="Times New Roman" w:hAnsi="Times New Roman" w:cs="Times New Roman"/>
+                <w:noProof/>
+                <w:webHidden/>
+              </w:rPr>
+              <w:fldChar w:fldCharType="end"/>
+            </w:r>
+          </w:hyperlink>
+        </w:p>
+        <w:p>
+          <w:pPr>
+            <w:pStyle w:val="TOC3"/>
+            <w:tabs>
+              <w:tab w:val="right" w:leader="dot" w:pos="9016"/>
+            </w:tabs>
+            <w:rPr>
+              <w:rFonts w:ascii="Times New Roman" w:hAnsi="Times New Roman" w:cs="Times New Roman"/>
               <w:noProof/>
             </w:rPr>
           </w:pPr>
-          <w:hyperlink w:anchor="_Toc226741965" w:history="1">
+          <w:hyperlink w:anchor="_Toc226834694" w:history="1">
             <w:r>
               <w:rPr>
                 <w:rStyle w:val="Hyperlink"/>
-                <w:noProof/>
-              </w:rPr>
-              <w:t>Enemy</w:t>
-            </w:r>
-            <w:r>
-              <w:rPr>
+                <w:rFonts w:ascii="Times New Roman" w:eastAsia="Arial" w:hAnsi="Times New Roman" w:cs="Times New Roman"/>
+                <w:noProof/>
+              </w:rPr>
+              <w:t>Texture Override</w:t>
+            </w:r>
+            <w:r>
+              <w:rPr>
+                <w:rFonts w:ascii="Times New Roman" w:hAnsi="Times New Roman" w:cs="Times New Roman"/>
                 <w:noProof/>
                 <w:webHidden/>
               </w:rPr>
@@ -548,6 +988,7 @@
             </w:r>
             <w:r>
               <w:rPr>
+                <w:rFonts w:ascii="Times New Roman" w:hAnsi="Times New Roman" w:cs="Times New Roman"/>
                 <w:noProof/>
                 <w:webHidden/>
               </w:rPr>
@@ -555,19 +996,22 @@
             </w:r>
             <w:r>
               <w:rPr>
-                <w:noProof/>
-                <w:webHidden/>
-              </w:rPr>
-              <w:instrText xml:space="preserve"> PAGEREF _Toc226741965 \h </w:instrText>
-            </w:r>
-            <w:r>
-              <w:rPr>
-                <w:noProof/>
-                <w:webHidden/>
-              </w:rPr>
-            </w:r>
-            <w:r>
-              <w:rPr>
+                <w:rFonts w:ascii="Times New Roman" w:hAnsi="Times New Roman" w:cs="Times New Roman"/>
+                <w:noProof/>
+                <w:webHidden/>
+              </w:rPr>
+              <w:instrText xml:space="preserve"> PAGEREF _Toc226834694 \h </w:instrText>
+            </w:r>
+            <w:r>
+              <w:rPr>
+                <w:rFonts w:ascii="Times New Roman" w:hAnsi="Times New Roman" w:cs="Times New Roman"/>
+                <w:noProof/>
+                <w:webHidden/>
+              </w:rPr>
+            </w:r>
+            <w:r>
+              <w:rPr>
+                <w:rFonts w:ascii="Times New Roman" w:hAnsi="Times New Roman" w:cs="Times New Roman"/>
                 <w:noProof/>
                 <w:webHidden/>
               </w:rPr>
@@ -575,13 +1019,246 @@
             </w:r>
             <w:r>
               <w:rPr>
-                <w:noProof/>
-                <w:webHidden/>
-              </w:rPr>
-              <w:t>3</w:t>
-            </w:r>
-            <w:r>
-              <w:rPr>
+                <w:rFonts w:ascii="Times New Roman" w:hAnsi="Times New Roman" w:cs="Times New Roman"/>
+                <w:noProof/>
+                <w:webHidden/>
+              </w:rPr>
+              <w:t>5</w:t>
+            </w:r>
+            <w:r>
+              <w:rPr>
+                <w:rFonts w:ascii="Times New Roman" w:hAnsi="Times New Roman" w:cs="Times New Roman"/>
+                <w:noProof/>
+                <w:webHidden/>
+              </w:rPr>
+              <w:fldChar w:fldCharType="end"/>
+            </w:r>
+          </w:hyperlink>
+        </w:p>
+        <w:p>
+          <w:pPr>
+            <w:pStyle w:val="TOC3"/>
+            <w:tabs>
+              <w:tab w:val="right" w:leader="dot" w:pos="9016"/>
+            </w:tabs>
+            <w:rPr>
+              <w:rFonts w:ascii="Times New Roman" w:hAnsi="Times New Roman" w:cs="Times New Roman"/>
+              <w:noProof/>
+            </w:rPr>
+          </w:pPr>
+          <w:hyperlink w:anchor="_Toc226834695" w:history="1">
+            <w:r>
+              <w:rPr>
+                <w:rStyle w:val="Hyperlink"/>
+                <w:rFonts w:ascii="Times New Roman" w:hAnsi="Times New Roman" w:cs="Times New Roman"/>
+                <w:noProof/>
+              </w:rPr>
+              <w:t>Sensor system</w:t>
+            </w:r>
+            <w:r>
+              <w:rPr>
+                <w:rFonts w:ascii="Times New Roman" w:hAnsi="Times New Roman" w:cs="Times New Roman"/>
+                <w:noProof/>
+                <w:webHidden/>
+              </w:rPr>
+              <w:tab/>
+            </w:r>
+            <w:r>
+              <w:rPr>
+                <w:rFonts w:ascii="Times New Roman" w:hAnsi="Times New Roman" w:cs="Times New Roman"/>
+                <w:noProof/>
+                <w:webHidden/>
+              </w:rPr>
+              <w:fldChar w:fldCharType="begin"/>
+            </w:r>
+            <w:r>
+              <w:rPr>
+                <w:rFonts w:ascii="Times New Roman" w:hAnsi="Times New Roman" w:cs="Times New Roman"/>
+                <w:noProof/>
+                <w:webHidden/>
+              </w:rPr>
+              <w:instrText xml:space="preserve"> PAGEREF _Toc226834695 \h </w:instrText>
+            </w:r>
+            <w:r>
+              <w:rPr>
+                <w:rFonts w:ascii="Times New Roman" w:hAnsi="Times New Roman" w:cs="Times New Roman"/>
+                <w:noProof/>
+                <w:webHidden/>
+              </w:rPr>
+            </w:r>
+            <w:r>
+              <w:rPr>
+                <w:rFonts w:ascii="Times New Roman" w:hAnsi="Times New Roman" w:cs="Times New Roman"/>
+                <w:noProof/>
+                <w:webHidden/>
+              </w:rPr>
+              <w:fldChar w:fldCharType="separate"/>
+            </w:r>
+            <w:r>
+              <w:rPr>
+                <w:rFonts w:ascii="Times New Roman" w:hAnsi="Times New Roman" w:cs="Times New Roman"/>
+                <w:noProof/>
+                <w:webHidden/>
+              </w:rPr>
+              <w:t>5</w:t>
+            </w:r>
+            <w:r>
+              <w:rPr>
+                <w:rFonts w:ascii="Times New Roman" w:hAnsi="Times New Roman" w:cs="Times New Roman"/>
+                <w:noProof/>
+                <w:webHidden/>
+              </w:rPr>
+              <w:fldChar w:fldCharType="end"/>
+            </w:r>
+          </w:hyperlink>
+        </w:p>
+        <w:p>
+          <w:pPr>
+            <w:pStyle w:val="TOC3"/>
+            <w:tabs>
+              <w:tab w:val="right" w:leader="dot" w:pos="9016"/>
+            </w:tabs>
+            <w:rPr>
+              <w:rFonts w:ascii="Times New Roman" w:hAnsi="Times New Roman" w:cs="Times New Roman"/>
+              <w:noProof/>
+            </w:rPr>
+          </w:pPr>
+          <w:hyperlink w:anchor="_Toc226834696" w:history="1">
+            <w:r>
+              <w:rPr>
+                <w:rStyle w:val="Hyperlink"/>
+                <w:rFonts w:ascii="Times New Roman" w:hAnsi="Times New Roman" w:cs="Times New Roman"/>
+                <w:noProof/>
+              </w:rPr>
+              <w:t>AI State</w:t>
+            </w:r>
+            <w:r>
+              <w:rPr>
+                <w:rFonts w:ascii="Times New Roman" w:hAnsi="Times New Roman" w:cs="Times New Roman"/>
+                <w:noProof/>
+                <w:webHidden/>
+              </w:rPr>
+              <w:tab/>
+            </w:r>
+            <w:r>
+              <w:rPr>
+                <w:rFonts w:ascii="Times New Roman" w:hAnsi="Times New Roman" w:cs="Times New Roman"/>
+                <w:noProof/>
+                <w:webHidden/>
+              </w:rPr>
+              <w:fldChar w:fldCharType="begin"/>
+            </w:r>
+            <w:r>
+              <w:rPr>
+                <w:rFonts w:ascii="Times New Roman" w:hAnsi="Times New Roman" w:cs="Times New Roman"/>
+                <w:noProof/>
+                <w:webHidden/>
+              </w:rPr>
+              <w:instrText xml:space="preserve"> PAGEREF _Toc226834696 \h </w:instrText>
+            </w:r>
+            <w:r>
+              <w:rPr>
+                <w:rFonts w:ascii="Times New Roman" w:hAnsi="Times New Roman" w:cs="Times New Roman"/>
+                <w:noProof/>
+                <w:webHidden/>
+              </w:rPr>
+            </w:r>
+            <w:r>
+              <w:rPr>
+                <w:rFonts w:ascii="Times New Roman" w:hAnsi="Times New Roman" w:cs="Times New Roman"/>
+                <w:noProof/>
+                <w:webHidden/>
+              </w:rPr>
+              <w:fldChar w:fldCharType="separate"/>
+            </w:r>
+            <w:r>
+              <w:rPr>
+                <w:rFonts w:ascii="Times New Roman" w:hAnsi="Times New Roman" w:cs="Times New Roman"/>
+                <w:noProof/>
+                <w:webHidden/>
+              </w:rPr>
+              <w:t>5</w:t>
+            </w:r>
+            <w:r>
+              <w:rPr>
+                <w:rFonts w:ascii="Times New Roman" w:hAnsi="Times New Roman" w:cs="Times New Roman"/>
+                <w:noProof/>
+                <w:webHidden/>
+              </w:rPr>
+              <w:fldChar w:fldCharType="end"/>
+            </w:r>
+          </w:hyperlink>
+        </w:p>
+        <w:p>
+          <w:pPr>
+            <w:pStyle w:val="TOC3"/>
+            <w:tabs>
+              <w:tab w:val="right" w:leader="dot" w:pos="9016"/>
+            </w:tabs>
+            <w:rPr>
+              <w:rFonts w:ascii="Times New Roman" w:hAnsi="Times New Roman" w:cs="Times New Roman"/>
+              <w:noProof/>
+            </w:rPr>
+          </w:pPr>
+          <w:hyperlink w:anchor="_Toc226834697" w:history="1">
+            <w:r>
+              <w:rPr>
+                <w:rStyle w:val="Hyperlink"/>
+                <w:rFonts w:ascii="Times New Roman" w:hAnsi="Times New Roman" w:cs="Times New Roman"/>
+                <w:noProof/>
+              </w:rPr>
+              <w:t>Fuzzy Logic</w:t>
+            </w:r>
+            <w:r>
+              <w:rPr>
+                <w:rFonts w:ascii="Times New Roman" w:hAnsi="Times New Roman" w:cs="Times New Roman"/>
+                <w:noProof/>
+                <w:webHidden/>
+              </w:rPr>
+              <w:tab/>
+            </w:r>
+            <w:r>
+              <w:rPr>
+                <w:rFonts w:ascii="Times New Roman" w:hAnsi="Times New Roman" w:cs="Times New Roman"/>
+                <w:noProof/>
+                <w:webHidden/>
+              </w:rPr>
+              <w:fldChar w:fldCharType="begin"/>
+            </w:r>
+            <w:r>
+              <w:rPr>
+                <w:rFonts w:ascii="Times New Roman" w:hAnsi="Times New Roman" w:cs="Times New Roman"/>
+                <w:noProof/>
+                <w:webHidden/>
+              </w:rPr>
+              <w:instrText xml:space="preserve"> PAGEREF _Toc226834697 \h </w:instrText>
+            </w:r>
+            <w:r>
+              <w:rPr>
+                <w:rFonts w:ascii="Times New Roman" w:hAnsi="Times New Roman" w:cs="Times New Roman"/>
+                <w:noProof/>
+                <w:webHidden/>
+              </w:rPr>
+            </w:r>
+            <w:r>
+              <w:rPr>
+                <w:rFonts w:ascii="Times New Roman" w:hAnsi="Times New Roman" w:cs="Times New Roman"/>
+                <w:noProof/>
+                <w:webHidden/>
+              </w:rPr>
+              <w:fldChar w:fldCharType="separate"/>
+            </w:r>
+            <w:r>
+              <w:rPr>
+                <w:rFonts w:ascii="Times New Roman" w:hAnsi="Times New Roman" w:cs="Times New Roman"/>
+                <w:noProof/>
+                <w:webHidden/>
+              </w:rPr>
+              <w:t>6</w:t>
+            </w:r>
+            <w:r>
+              <w:rPr>
+                <w:rFonts w:ascii="Times New Roman" w:hAnsi="Times New Roman" w:cs="Times New Roman"/>
                 <w:noProof/>
                 <w:webHidden/>
               </w:rPr>
@@ -596,19 +1273,102 @@
               <w:tab w:val="right" w:leader="dot" w:pos="9016"/>
             </w:tabs>
             <w:rPr>
+              <w:rFonts w:ascii="Times New Roman" w:eastAsiaTheme="minorEastAsia" w:hAnsi="Times New Roman" w:cs="Times New Roman"/>
+              <w:noProof/>
+              <w:sz w:val="24"/>
+              <w:szCs w:val="24"/>
+              <w:lang w:eastAsia="en-GB"/>
+            </w:rPr>
+          </w:pPr>
+          <w:hyperlink w:anchor="_Toc226834698" w:history="1">
+            <w:r>
+              <w:rPr>
+                <w:rStyle w:val="Hyperlink"/>
+                <w:rFonts w:ascii="Times New Roman" w:hAnsi="Times New Roman" w:cs="Times New Roman"/>
+                <w:noProof/>
+              </w:rPr>
+              <w:t>The State Machine</w:t>
+            </w:r>
+            <w:r>
+              <w:rPr>
+                <w:rFonts w:ascii="Times New Roman" w:hAnsi="Times New Roman" w:cs="Times New Roman"/>
+                <w:noProof/>
+                <w:webHidden/>
+              </w:rPr>
+              <w:tab/>
+            </w:r>
+            <w:r>
+              <w:rPr>
+                <w:rFonts w:ascii="Times New Roman" w:hAnsi="Times New Roman" w:cs="Times New Roman"/>
+                <w:noProof/>
+                <w:webHidden/>
+              </w:rPr>
+              <w:fldChar w:fldCharType="begin"/>
+            </w:r>
+            <w:r>
+              <w:rPr>
+                <w:rFonts w:ascii="Times New Roman" w:hAnsi="Times New Roman" w:cs="Times New Roman"/>
+                <w:noProof/>
+                <w:webHidden/>
+              </w:rPr>
+              <w:instrText xml:space="preserve"> PAGEREF _Toc226834698 \h </w:instrText>
+            </w:r>
+            <w:r>
+              <w:rPr>
+                <w:rFonts w:ascii="Times New Roman" w:hAnsi="Times New Roman" w:cs="Times New Roman"/>
+                <w:noProof/>
+                <w:webHidden/>
+              </w:rPr>
+            </w:r>
+            <w:r>
+              <w:rPr>
+                <w:rFonts w:ascii="Times New Roman" w:hAnsi="Times New Roman" w:cs="Times New Roman"/>
+                <w:noProof/>
+                <w:webHidden/>
+              </w:rPr>
+              <w:fldChar w:fldCharType="separate"/>
+            </w:r>
+            <w:r>
+              <w:rPr>
+                <w:rFonts w:ascii="Times New Roman" w:hAnsi="Times New Roman" w:cs="Times New Roman"/>
+                <w:noProof/>
+                <w:webHidden/>
+              </w:rPr>
+              <w:t>7</w:t>
+            </w:r>
+            <w:r>
+              <w:rPr>
+                <w:rFonts w:ascii="Times New Roman" w:hAnsi="Times New Roman" w:cs="Times New Roman"/>
+                <w:noProof/>
+                <w:webHidden/>
+              </w:rPr>
+              <w:fldChar w:fldCharType="end"/>
+            </w:r>
+          </w:hyperlink>
+        </w:p>
+        <w:p>
+          <w:pPr>
+            <w:pStyle w:val="TOC3"/>
+            <w:tabs>
+              <w:tab w:val="right" w:leader="dot" w:pos="9016"/>
+            </w:tabs>
+            <w:rPr>
+              <w:rFonts w:ascii="Times New Roman" w:hAnsi="Times New Roman" w:cs="Times New Roman"/>
               <w:noProof/>
             </w:rPr>
           </w:pPr>
-          <w:hyperlink w:anchor="_Toc226741966" w:history="1">
+          <w:hyperlink w:anchor="_Toc226834699" w:history="1">
             <w:r>
               <w:rPr>
                 <w:rStyle w:val="Hyperlink"/>
-                <w:noProof/>
-              </w:rPr>
-              <w:t>The State Machine</w:t>
-            </w:r>
-            <w:r>
-              <w:rPr>
+                <w:rFonts w:ascii="Times New Roman" w:hAnsi="Times New Roman" w:cs="Times New Roman"/>
+                <w:noProof/>
+              </w:rPr>
+              <w:t>Movement States</w:t>
+            </w:r>
+            <w:r>
+              <w:rPr>
+                <w:rFonts w:ascii="Times New Roman" w:hAnsi="Times New Roman" w:cs="Times New Roman"/>
                 <w:noProof/>
                 <w:webHidden/>
               </w:rPr>
@@ -616,6 +1376,7 @@
             </w:r>
             <w:r>
               <w:rPr>
+                <w:rFonts w:ascii="Times New Roman" w:hAnsi="Times New Roman" w:cs="Times New Roman"/>
                 <w:noProof/>
                 <w:webHidden/>
               </w:rPr>
@@ -623,19 +1384,22 @@
             </w:r>
             <w:r>
               <w:rPr>
-                <w:noProof/>
-                <w:webHidden/>
-              </w:rPr>
-              <w:instrText xml:space="preserve"> PAGEREF _Toc226741966 \h </w:instrText>
-            </w:r>
-            <w:r>
-              <w:rPr>
-                <w:noProof/>
-                <w:webHidden/>
-              </w:rPr>
-            </w:r>
-            <w:r>
-              <w:rPr>
+                <w:rFonts w:ascii="Times New Roman" w:hAnsi="Times New Roman" w:cs="Times New Roman"/>
+                <w:noProof/>
+                <w:webHidden/>
+              </w:rPr>
+              <w:instrText xml:space="preserve"> PAGEREF _Toc226834699 \h </w:instrText>
+            </w:r>
+            <w:r>
+              <w:rPr>
+                <w:rFonts w:ascii="Times New Roman" w:hAnsi="Times New Roman" w:cs="Times New Roman"/>
+                <w:noProof/>
+                <w:webHidden/>
+              </w:rPr>
+            </w:r>
+            <w:r>
+              <w:rPr>
+                <w:rFonts w:ascii="Times New Roman" w:hAnsi="Times New Roman" w:cs="Times New Roman"/>
                 <w:noProof/>
                 <w:webHidden/>
               </w:rPr>
@@ -643,13 +1407,169 @@
             </w:r>
             <w:r>
               <w:rPr>
-                <w:noProof/>
-                <w:webHidden/>
-              </w:rPr>
-              <w:t>4</w:t>
-            </w:r>
-            <w:r>
-              <w:rPr>
+                <w:rFonts w:ascii="Times New Roman" w:hAnsi="Times New Roman" w:cs="Times New Roman"/>
+                <w:noProof/>
+                <w:webHidden/>
+              </w:rPr>
+              <w:t>7</w:t>
+            </w:r>
+            <w:r>
+              <w:rPr>
+                <w:rFonts w:ascii="Times New Roman" w:hAnsi="Times New Roman" w:cs="Times New Roman"/>
+                <w:noProof/>
+                <w:webHidden/>
+              </w:rPr>
+              <w:fldChar w:fldCharType="end"/>
+            </w:r>
+          </w:hyperlink>
+        </w:p>
+        <w:p>
+          <w:pPr>
+            <w:pStyle w:val="TOC3"/>
+            <w:tabs>
+              <w:tab w:val="right" w:leader="dot" w:pos="9016"/>
+            </w:tabs>
+            <w:rPr>
+              <w:rFonts w:ascii="Times New Roman" w:hAnsi="Times New Roman" w:cs="Times New Roman"/>
+              <w:noProof/>
+            </w:rPr>
+          </w:pPr>
+          <w:hyperlink w:anchor="_Toc226834700" w:history="1">
+            <w:r>
+              <w:rPr>
+                <w:rStyle w:val="Hyperlink"/>
+                <w:rFonts w:ascii="Times New Roman" w:hAnsi="Times New Roman" w:cs="Times New Roman"/>
+                <w:noProof/>
+              </w:rPr>
+              <w:t>Transition States</w:t>
+            </w:r>
+            <w:r>
+              <w:rPr>
+                <w:rFonts w:ascii="Times New Roman" w:hAnsi="Times New Roman" w:cs="Times New Roman"/>
+                <w:noProof/>
+                <w:webHidden/>
+              </w:rPr>
+              <w:tab/>
+            </w:r>
+            <w:r>
+              <w:rPr>
+                <w:rFonts w:ascii="Times New Roman" w:hAnsi="Times New Roman" w:cs="Times New Roman"/>
+                <w:noProof/>
+                <w:webHidden/>
+              </w:rPr>
+              <w:fldChar w:fldCharType="begin"/>
+            </w:r>
+            <w:r>
+              <w:rPr>
+                <w:rFonts w:ascii="Times New Roman" w:hAnsi="Times New Roman" w:cs="Times New Roman"/>
+                <w:noProof/>
+                <w:webHidden/>
+              </w:rPr>
+              <w:instrText xml:space="preserve"> PAGEREF _Toc226834700 \h </w:instrText>
+            </w:r>
+            <w:r>
+              <w:rPr>
+                <w:rFonts w:ascii="Times New Roman" w:hAnsi="Times New Roman" w:cs="Times New Roman"/>
+                <w:noProof/>
+                <w:webHidden/>
+              </w:rPr>
+            </w:r>
+            <w:r>
+              <w:rPr>
+                <w:rFonts w:ascii="Times New Roman" w:hAnsi="Times New Roman" w:cs="Times New Roman"/>
+                <w:noProof/>
+                <w:webHidden/>
+              </w:rPr>
+              <w:fldChar w:fldCharType="separate"/>
+            </w:r>
+            <w:r>
+              <w:rPr>
+                <w:rFonts w:ascii="Times New Roman" w:hAnsi="Times New Roman" w:cs="Times New Roman"/>
+                <w:noProof/>
+                <w:webHidden/>
+              </w:rPr>
+              <w:t>7</w:t>
+            </w:r>
+            <w:r>
+              <w:rPr>
+                <w:rFonts w:ascii="Times New Roman" w:hAnsi="Times New Roman" w:cs="Times New Roman"/>
+                <w:noProof/>
+                <w:webHidden/>
+              </w:rPr>
+              <w:fldChar w:fldCharType="end"/>
+            </w:r>
+          </w:hyperlink>
+        </w:p>
+        <w:p>
+          <w:pPr>
+            <w:pStyle w:val="TOC3"/>
+            <w:tabs>
+              <w:tab w:val="right" w:leader="dot" w:pos="9016"/>
+            </w:tabs>
+            <w:rPr>
+              <w:rFonts w:ascii="Times New Roman" w:hAnsi="Times New Roman" w:cs="Times New Roman"/>
+              <w:noProof/>
+            </w:rPr>
+          </w:pPr>
+          <w:hyperlink w:anchor="_Toc226834701" w:history="1">
+            <w:r>
+              <w:rPr>
+                <w:rStyle w:val="Hyperlink"/>
+                <w:rFonts w:ascii="Times New Roman" w:hAnsi="Times New Roman" w:cs="Times New Roman"/>
+                <w:noProof/>
+              </w:rPr>
+              <w:t>Combat states</w:t>
+            </w:r>
+            <w:r>
+              <w:rPr>
+                <w:rFonts w:ascii="Times New Roman" w:hAnsi="Times New Roman" w:cs="Times New Roman"/>
+                <w:noProof/>
+                <w:webHidden/>
+              </w:rPr>
+              <w:tab/>
+            </w:r>
+            <w:r>
+              <w:rPr>
+                <w:rFonts w:ascii="Times New Roman" w:hAnsi="Times New Roman" w:cs="Times New Roman"/>
+                <w:noProof/>
+                <w:webHidden/>
+              </w:rPr>
+              <w:fldChar w:fldCharType="begin"/>
+            </w:r>
+            <w:r>
+              <w:rPr>
+                <w:rFonts w:ascii="Times New Roman" w:hAnsi="Times New Roman" w:cs="Times New Roman"/>
+                <w:noProof/>
+                <w:webHidden/>
+              </w:rPr>
+              <w:instrText xml:space="preserve"> PAGEREF _Toc226834701 \h </w:instrText>
+            </w:r>
+            <w:r>
+              <w:rPr>
+                <w:rFonts w:ascii="Times New Roman" w:hAnsi="Times New Roman" w:cs="Times New Roman"/>
+                <w:noProof/>
+                <w:webHidden/>
+              </w:rPr>
+            </w:r>
+            <w:r>
+              <w:rPr>
+                <w:rFonts w:ascii="Times New Roman" w:hAnsi="Times New Roman" w:cs="Times New Roman"/>
+                <w:noProof/>
+                <w:webHidden/>
+              </w:rPr>
+              <w:fldChar w:fldCharType="separate"/>
+            </w:r>
+            <w:r>
+              <w:rPr>
+                <w:rFonts w:ascii="Times New Roman" w:hAnsi="Times New Roman" w:cs="Times New Roman"/>
+                <w:noProof/>
+                <w:webHidden/>
+              </w:rPr>
+              <w:t>8</w:t>
+            </w:r>
+            <w:r>
+              <w:rPr>
+                <w:rFonts w:ascii="Times New Roman" w:hAnsi="Times New Roman" w:cs="Times New Roman"/>
                 <w:noProof/>
                 <w:webHidden/>
               </w:rPr>
@@ -664,10 +1584,14 @@
               <w:tab w:val="right" w:leader="dot" w:pos="9016"/>
             </w:tabs>
             <w:rPr>
+              <w:rFonts w:ascii="Times New Roman" w:eastAsiaTheme="minorEastAsia" w:hAnsi="Times New Roman" w:cs="Times New Roman"/>
               <w:noProof/>
+              <w:sz w:val="24"/>
+              <w:szCs w:val="24"/>
+              <w:lang w:eastAsia="en-GB"/>
             </w:rPr>
           </w:pPr>
-          <w:hyperlink w:anchor="_Toc226741967" w:history="1">
+          <w:hyperlink w:anchor="_Toc226834702" w:history="1">
             <w:r>
               <w:rPr>
                 <w:rStyle w:val="Hyperlink"/>
@@ -678,6 +1602,7 @@
             </w:r>
             <w:r>
               <w:rPr>
+                <w:rFonts w:ascii="Times New Roman" w:hAnsi="Times New Roman" w:cs="Times New Roman"/>
                 <w:noProof/>
                 <w:webHidden/>
               </w:rPr>
@@ -685,6 +1610,7 @@
             </w:r>
             <w:r>
               <w:rPr>
+                <w:rFonts w:ascii="Times New Roman" w:hAnsi="Times New Roman" w:cs="Times New Roman"/>
                 <w:noProof/>
                 <w:webHidden/>
               </w:rPr>
@@ -692,19 +1618,22 @@
             </w:r>
             <w:r>
               <w:rPr>
-                <w:noProof/>
-                <w:webHidden/>
-              </w:rPr>
-              <w:instrText xml:space="preserve"> PAGEREF _Toc226741967 \h </w:instrText>
-            </w:r>
-            <w:r>
-              <w:rPr>
-                <w:noProof/>
-                <w:webHidden/>
-              </w:rPr>
-            </w:r>
-            <w:r>
-              <w:rPr>
+                <w:rFonts w:ascii="Times New Roman" w:hAnsi="Times New Roman" w:cs="Times New Roman"/>
+                <w:noProof/>
+                <w:webHidden/>
+              </w:rPr>
+              <w:instrText xml:space="preserve"> PAGEREF _Toc226834702 \h </w:instrText>
+            </w:r>
+            <w:r>
+              <w:rPr>
+                <w:rFonts w:ascii="Times New Roman" w:hAnsi="Times New Roman" w:cs="Times New Roman"/>
+                <w:noProof/>
+                <w:webHidden/>
+              </w:rPr>
+            </w:r>
+            <w:r>
+              <w:rPr>
+                <w:rFonts w:ascii="Times New Roman" w:hAnsi="Times New Roman" w:cs="Times New Roman"/>
                 <w:noProof/>
                 <w:webHidden/>
               </w:rPr>
@@ -712,13 +1641,15 @@
             </w:r>
             <w:r>
               <w:rPr>
-                <w:noProof/>
-                <w:webHidden/>
-              </w:rPr>
-              <w:t>4</w:t>
-            </w:r>
-            <w:r>
-              <w:rPr>
+                <w:rFonts w:ascii="Times New Roman" w:hAnsi="Times New Roman" w:cs="Times New Roman"/>
+                <w:noProof/>
+                <w:webHidden/>
+              </w:rPr>
+              <w:t>9</w:t>
+            </w:r>
+            <w:r>
+              <w:rPr>
+                <w:rFonts w:ascii="Times New Roman" w:hAnsi="Times New Roman" w:cs="Times New Roman"/>
                 <w:noProof/>
                 <w:webHidden/>
               </w:rPr>
@@ -733,10 +1664,14 @@
               <w:tab w:val="right" w:leader="dot" w:pos="9016"/>
             </w:tabs>
             <w:rPr>
+              <w:rFonts w:ascii="Times New Roman" w:eastAsiaTheme="minorEastAsia" w:hAnsi="Times New Roman" w:cs="Times New Roman"/>
               <w:noProof/>
+              <w:sz w:val="24"/>
+              <w:szCs w:val="24"/>
+              <w:lang w:eastAsia="en-GB"/>
             </w:rPr>
           </w:pPr>
-          <w:hyperlink w:anchor="_Toc226741968" w:history="1">
+          <w:hyperlink w:anchor="_Toc226834703" w:history="1">
             <w:r>
               <w:rPr>
                 <w:rStyle w:val="Hyperlink"/>
@@ -747,6 +1682,7 @@
             </w:r>
             <w:r>
               <w:rPr>
+                <w:rFonts w:ascii="Times New Roman" w:hAnsi="Times New Roman" w:cs="Times New Roman"/>
                 <w:noProof/>
                 <w:webHidden/>
               </w:rPr>
@@ -754,6 +1690,7 @@
             </w:r>
             <w:r>
               <w:rPr>
+                <w:rFonts w:ascii="Times New Roman" w:hAnsi="Times New Roman" w:cs="Times New Roman"/>
                 <w:noProof/>
                 <w:webHidden/>
               </w:rPr>
@@ -761,19 +1698,22 @@
             </w:r>
             <w:r>
               <w:rPr>
-                <w:noProof/>
-                <w:webHidden/>
-              </w:rPr>
-              <w:instrText xml:space="preserve"> PAGEREF _Toc226741968 \h </w:instrText>
-            </w:r>
-            <w:r>
-              <w:rPr>
-                <w:noProof/>
-                <w:webHidden/>
-              </w:rPr>
-            </w:r>
-            <w:r>
-              <w:rPr>
+                <w:rFonts w:ascii="Times New Roman" w:hAnsi="Times New Roman" w:cs="Times New Roman"/>
+                <w:noProof/>
+                <w:webHidden/>
+              </w:rPr>
+              <w:instrText xml:space="preserve"> PAGEREF _Toc226834703 \h </w:instrText>
+            </w:r>
+            <w:r>
+              <w:rPr>
+                <w:rFonts w:ascii="Times New Roman" w:hAnsi="Times New Roman" w:cs="Times New Roman"/>
+                <w:noProof/>
+                <w:webHidden/>
+              </w:rPr>
+            </w:r>
+            <w:r>
+              <w:rPr>
+                <w:rFonts w:ascii="Times New Roman" w:hAnsi="Times New Roman" w:cs="Times New Roman"/>
                 <w:noProof/>
                 <w:webHidden/>
               </w:rPr>
@@ -781,13 +1721,15 @@
             </w:r>
             <w:r>
               <w:rPr>
-                <w:noProof/>
-                <w:webHidden/>
-              </w:rPr>
-              <w:t>4</w:t>
-            </w:r>
-            <w:r>
-              <w:rPr>
+                <w:rFonts w:ascii="Times New Roman" w:hAnsi="Times New Roman" w:cs="Times New Roman"/>
+                <w:noProof/>
+                <w:webHidden/>
+              </w:rPr>
+              <w:t>10</w:t>
+            </w:r>
+            <w:r>
+              <w:rPr>
+                <w:rFonts w:ascii="Times New Roman" w:hAnsi="Times New Roman" w:cs="Times New Roman"/>
                 <w:noProof/>
                 <w:webHidden/>
               </w:rPr>
@@ -798,6 +1740,7 @@
         <w:p>
           <w:r>
             <w:rPr>
+              <w:rFonts w:ascii="Times New Roman" w:hAnsi="Times New Roman" w:cs="Times New Roman"/>
               <w:b/>
               <w:bCs/>
               <w:noProof/>
@@ -995,12 +1938,14 @@
           <w:rFonts w:ascii="Times New Roman" w:hAnsi="Times New Roman" w:cs="Times New Roman"/>
         </w:rPr>
       </w:pPr>
+      <w:bookmarkStart w:id="0" w:name="_Toc226834686"/>
       <w:r>
         <w:rPr>
           <w:rFonts w:ascii="Times New Roman" w:hAnsi="Times New Roman" w:cs="Times New Roman"/>
         </w:rPr>
         <w:t>Project Overview</w:t>
       </w:r>
+      <w:bookmarkEnd w:id="0"/>
     </w:p>
     <w:p>
       <w:pPr>
@@ -1100,14 +2045,14 @@
           <w:rFonts w:ascii="Times New Roman" w:hAnsi="Times New Roman" w:cs="Times New Roman"/>
         </w:rPr>
       </w:pPr>
-      <w:bookmarkStart w:id="0" w:name="_Toc226741962"/>
+      <w:bookmarkStart w:id="1" w:name="_Toc226834687"/>
       <w:r>
         <w:rPr>
           <w:rFonts w:ascii="Times New Roman" w:hAnsi="Times New Roman" w:cs="Times New Roman"/>
         </w:rPr>
         <w:t>Technical Design</w:t>
       </w:r>
-      <w:bookmarkEnd w:id="0"/>
+      <w:bookmarkEnd w:id="1"/>
     </w:p>
     <w:p>
       <w:pPr>
@@ -1118,7 +2063,7 @@
           <w:szCs w:val="36"/>
         </w:rPr>
       </w:pPr>
-      <w:bookmarkStart w:id="1" w:name="_Toc226741963"/>
+      <w:bookmarkStart w:id="2" w:name="_Toc226834688"/>
       <w:r>
         <w:rPr>
           <w:rFonts w:ascii="Times New Roman" w:hAnsi="Times New Roman" w:cs="Times New Roman"/>
@@ -1127,7 +2072,7 @@
         </w:rPr>
         <w:t>Entity</w:t>
       </w:r>
-      <w:bookmarkEnd w:id="1"/>
+      <w:bookmarkEnd w:id="2"/>
     </w:p>
     <w:p>
       <w:pPr>
@@ -1340,6 +2285,7 @@
           <w:sz w:val="24"/>
           <w:szCs w:val="24"/>
         </w:rPr>
+        <w:lastRenderedPageBreak/>
         <w:t>physics variables</w:t>
       </w:r>
     </w:p>
@@ -1463,7 +2409,7 @@
           <w:szCs w:val="40"/>
         </w:rPr>
       </w:pPr>
-      <w:bookmarkStart w:id="2" w:name="_Toc226741964"/>
+      <w:bookmarkStart w:id="3" w:name="_Toc226834689"/>
       <w:r>
         <w:rPr>
           <w:rFonts w:ascii="Times New Roman" w:hAnsi="Times New Roman" w:cs="Times New Roman"/>
@@ -1472,7 +2418,7 @@
         </w:rPr>
         <w:t>Player</w:t>
       </w:r>
-      <w:bookmarkEnd w:id="2"/>
+      <w:bookmarkEnd w:id="3"/>
     </w:p>
     <w:p>
       <w:pPr>
@@ -1515,12 +2461,14 @@
           <w:rFonts w:ascii="Times New Roman" w:hAnsi="Times New Roman" w:cs="Times New Roman"/>
         </w:rPr>
       </w:pPr>
+      <w:bookmarkStart w:id="4" w:name="_Toc226834690"/>
       <w:r>
         <w:rPr>
           <w:rFonts w:ascii="Times New Roman" w:hAnsi="Times New Roman" w:cs="Times New Roman"/>
         </w:rPr>
         <w:t>Input Handling</w:t>
       </w:r>
+      <w:bookmarkEnd w:id="4"/>
     </w:p>
     <w:p>
       <w:pPr>
@@ -1585,58 +2533,140 @@
           <w:sz w:val="24"/>
           <w:szCs w:val="24"/>
         </w:rPr>
-        <w:t>eft / Pressing Right – A or D key pressed</w:t>
-      </w:r>
-    </w:p>
-    <w:p>
-      <w:pPr>
-        <w:rPr>
-          <w:rFonts w:ascii="Times New Roman" w:hAnsi="Times New Roman" w:cs="Times New Roman"/>
-          <w:sz w:val="24"/>
-          <w:szCs w:val="24"/>
-        </w:rPr>
-      </w:pPr>
-      <w:r>
-        <w:rPr>
-          <w:rFonts w:ascii="Times New Roman" w:hAnsi="Times New Roman" w:cs="Times New Roman"/>
-          <w:sz w:val="24"/>
-          <w:szCs w:val="24"/>
-        </w:rPr>
-        <w:t>Crouching – left Ctrl</w:t>
-      </w:r>
-    </w:p>
-    <w:p>
-      <w:pPr>
-        <w:rPr>
-          <w:rFonts w:ascii="Times New Roman" w:hAnsi="Times New Roman" w:cs="Times New Roman"/>
-          <w:sz w:val="24"/>
-          <w:szCs w:val="24"/>
-        </w:rPr>
-      </w:pPr>
-      <w:r>
-        <w:rPr>
-          <w:rFonts w:ascii="Times New Roman" w:hAnsi="Times New Roman" w:cs="Times New Roman"/>
-          <w:sz w:val="24"/>
-          <w:szCs w:val="24"/>
-        </w:rPr>
-        <w:t xml:space="preserve">Running – left Shift </w:t>
-      </w:r>
-    </w:p>
-    <w:p>
-      <w:pPr>
-        <w:rPr>
-          <w:rFonts w:ascii="Times New Roman" w:hAnsi="Times New Roman" w:cs="Times New Roman"/>
-          <w:sz w:val="24"/>
-          <w:szCs w:val="24"/>
-        </w:rPr>
-      </w:pPr>
-      <w:r>
-        <w:rPr>
-          <w:rFonts w:ascii="Times New Roman" w:hAnsi="Times New Roman" w:cs="Times New Roman"/>
-          <w:sz w:val="24"/>
-          <w:szCs w:val="24"/>
-        </w:rPr>
-        <w:t xml:space="preserve">isJumping – Space </w:t>
+        <w:t xml:space="preserve">eft / Pressing Right </w:t>
+      </w:r>
+      <w:r>
+        <w:rPr>
+          <w:rFonts w:ascii="Times New Roman" w:hAnsi="Times New Roman" w:cs="Times New Roman"/>
+          <w:sz w:val="24"/>
+          <w:szCs w:val="24"/>
+        </w:rPr>
+        <w:t>-</w:t>
+      </w:r>
+      <w:r>
+        <w:rPr>
+          <w:rFonts w:ascii="Times New Roman" w:hAnsi="Times New Roman" w:cs="Times New Roman"/>
+          <w:sz w:val="24"/>
+          <w:szCs w:val="24"/>
+        </w:rPr>
+        <w:t xml:space="preserve"> A or D key pressed</w:t>
+      </w:r>
+    </w:p>
+    <w:p>
+      <w:pPr>
+        <w:rPr>
+          <w:rFonts w:ascii="Times New Roman" w:hAnsi="Times New Roman" w:cs="Times New Roman"/>
+          <w:sz w:val="24"/>
+          <w:szCs w:val="24"/>
+        </w:rPr>
+      </w:pPr>
+      <w:r>
+        <w:rPr>
+          <w:rFonts w:ascii="Times New Roman" w:hAnsi="Times New Roman" w:cs="Times New Roman"/>
+          <w:sz w:val="24"/>
+          <w:szCs w:val="24"/>
+        </w:rPr>
+        <w:t xml:space="preserve">Crouching </w:t>
+      </w:r>
+      <w:r>
+        <w:rPr>
+          <w:rFonts w:ascii="Times New Roman" w:hAnsi="Times New Roman" w:cs="Times New Roman"/>
+          <w:sz w:val="24"/>
+          <w:szCs w:val="24"/>
+        </w:rPr>
+        <w:t>-</w:t>
+      </w:r>
+      <w:r>
+        <w:rPr>
+          <w:rFonts w:ascii="Times New Roman" w:hAnsi="Times New Roman" w:cs="Times New Roman"/>
+          <w:sz w:val="24"/>
+          <w:szCs w:val="24"/>
+        </w:rPr>
+        <w:t xml:space="preserve"> left Ctrl</w:t>
+      </w:r>
+      <w:r>
+        <w:rPr>
+          <w:rFonts w:ascii="Times New Roman" w:hAnsi="Times New Roman" w:cs="Times New Roman"/>
+          <w:sz w:val="24"/>
+          <w:szCs w:val="24"/>
+        </w:rPr>
+        <w:t xml:space="preserve"> </w:t>
+      </w:r>
+    </w:p>
+    <w:p>
+      <w:pPr>
+        <w:rPr>
+          <w:rFonts w:ascii="Times New Roman" w:hAnsi="Times New Roman" w:cs="Times New Roman"/>
+          <w:sz w:val="24"/>
+          <w:szCs w:val="24"/>
+        </w:rPr>
+      </w:pPr>
+      <w:r>
+        <w:rPr>
+          <w:rFonts w:ascii="Times New Roman" w:hAnsi="Times New Roman" w:cs="Times New Roman"/>
+          <w:sz w:val="24"/>
+          <w:szCs w:val="24"/>
+        </w:rPr>
+        <w:t xml:space="preserve">Running </w:t>
+      </w:r>
+      <w:r>
+        <w:rPr>
+          <w:rFonts w:ascii="Times New Roman" w:hAnsi="Times New Roman" w:cs="Times New Roman"/>
+          <w:sz w:val="24"/>
+          <w:szCs w:val="24"/>
+        </w:rPr>
+        <w:t>-</w:t>
+      </w:r>
+      <w:r>
+        <w:rPr>
+          <w:rFonts w:ascii="Times New Roman" w:hAnsi="Times New Roman" w:cs="Times New Roman"/>
+          <w:sz w:val="24"/>
+          <w:szCs w:val="24"/>
+        </w:rPr>
+        <w:t xml:space="preserve"> left Shift </w:t>
+      </w:r>
+    </w:p>
+    <w:p>
+      <w:pPr>
+        <w:rPr>
+          <w:rFonts w:ascii="Times New Roman" w:hAnsi="Times New Roman" w:cs="Times New Roman"/>
+          <w:sz w:val="24"/>
+          <w:szCs w:val="24"/>
+        </w:rPr>
+      </w:pPr>
+      <w:proofErr w:type="spellStart"/>
+      <w:r>
+        <w:rPr>
+          <w:rFonts w:ascii="Times New Roman" w:hAnsi="Times New Roman" w:cs="Times New Roman"/>
+          <w:sz w:val="24"/>
+          <w:szCs w:val="24"/>
+        </w:rPr>
+        <w:t>isJumping</w:t>
+      </w:r>
+      <w:proofErr w:type="spellEnd"/>
+      <w:r>
+        <w:rPr>
+          <w:rFonts w:ascii="Times New Roman" w:hAnsi="Times New Roman" w:cs="Times New Roman"/>
+          <w:sz w:val="24"/>
+          <w:szCs w:val="24"/>
+        </w:rPr>
+        <w:t xml:space="preserve"> </w:t>
+      </w:r>
+      <w:r>
+        <w:rPr>
+          <w:rFonts w:ascii="Times New Roman" w:hAnsi="Times New Roman" w:cs="Times New Roman"/>
+          <w:sz w:val="24"/>
+          <w:szCs w:val="24"/>
+        </w:rPr>
+        <w:t>-</w:t>
+      </w:r>
+      <w:r>
+        <w:rPr>
+          <w:rFonts w:ascii="Times New Roman" w:hAnsi="Times New Roman" w:cs="Times New Roman"/>
+          <w:sz w:val="24"/>
+          <w:szCs w:val="24"/>
+        </w:rPr>
+        <w:t xml:space="preserve"> Space </w:t>
       </w:r>
     </w:p>
     <w:p>
@@ -1696,55 +2726,25 @@
           <w:sz w:val="24"/>
           <w:szCs w:val="24"/>
         </w:rPr>
-        <w:t xml:space="preserve">These inputs are then read by whichever state is currently active in </w:t>
-      </w:r>
-      <w:r>
-        <w:rPr>
-          <w:rFonts w:ascii="Times New Roman" w:hAnsi="Times New Roman" w:cs="Times New Roman"/>
-          <w:sz w:val="24"/>
-          <w:szCs w:val="24"/>
-        </w:rPr>
-        <w:t xml:space="preserve">its </w:t>
-      </w:r>
-      <w:r>
-        <w:rPr>
-          <w:rFonts w:ascii="Times New Roman" w:hAnsi="Times New Roman" w:cs="Times New Roman"/>
-          <w:sz w:val="24"/>
-          <w:szCs w:val="24"/>
-        </w:rPr>
-        <w:t>update()</w:t>
-      </w:r>
-      <w:r>
-        <w:rPr>
-          <w:rFonts w:ascii="Times New Roman" w:hAnsi="Times New Roman" w:cs="Times New Roman"/>
-          <w:sz w:val="24"/>
-          <w:szCs w:val="24"/>
-        </w:rPr>
-        <w:t xml:space="preserve"> function</w:t>
-      </w:r>
-      <w:r>
-        <w:rPr>
-          <w:rFonts w:ascii="Times New Roman" w:hAnsi="Times New Roman" w:cs="Times New Roman"/>
-          <w:sz w:val="24"/>
-          <w:szCs w:val="24"/>
-        </w:rPr>
-        <w:t>. The state determines how to respond to them</w:t>
-      </w:r>
-      <w:r>
-        <w:rPr>
-          <w:rFonts w:ascii="Times New Roman" w:hAnsi="Times New Roman" w:cs="Times New Roman"/>
-          <w:sz w:val="24"/>
-          <w:szCs w:val="24"/>
-        </w:rPr>
-        <w:t xml:space="preserve">, </w:t>
-      </w:r>
-      <w:r>
-        <w:rPr>
-          <w:rFonts w:ascii="Times New Roman" w:hAnsi="Times New Roman" w:cs="Times New Roman"/>
-          <w:sz w:val="24"/>
-          <w:szCs w:val="24"/>
-        </w:rPr>
-        <w:t>for example, StateWalking uses pressingRight/Left to move the entity and checks running to transition into StateRunning.</w:t>
+        <w:t xml:space="preserve">These inputs are then read by whichever state is currently active in its </w:t>
+      </w:r>
+      <w:proofErr w:type="gramStart"/>
+      <w:r>
+        <w:rPr>
+          <w:rFonts w:ascii="Times New Roman" w:hAnsi="Times New Roman" w:cs="Times New Roman"/>
+          <w:sz w:val="24"/>
+          <w:szCs w:val="24"/>
+        </w:rPr>
+        <w:t>update(</w:t>
+      </w:r>
+      <w:proofErr w:type="gramEnd"/>
+      <w:r>
+        <w:rPr>
+          <w:rFonts w:ascii="Times New Roman" w:hAnsi="Times New Roman" w:cs="Times New Roman"/>
+          <w:sz w:val="24"/>
+          <w:szCs w:val="24"/>
+        </w:rPr>
+        <w:t>) function. The state determines how to respond to them, for example, StateWalking uses pressingRight/Left to move the entity and checks running to transition into StateRunning.</w:t>
       </w:r>
     </w:p>
     <w:p>
@@ -1763,12 +2763,14 @@
           <w:rFonts w:ascii="Times New Roman" w:hAnsi="Times New Roman" w:cs="Times New Roman"/>
         </w:rPr>
       </w:pPr>
+      <w:bookmarkStart w:id="5" w:name="_Toc226834691"/>
       <w:r>
         <w:rPr>
           <w:rFonts w:ascii="Times New Roman" w:hAnsi="Times New Roman" w:cs="Times New Roman"/>
         </w:rPr>
         <w:t>Facing Direction</w:t>
       </w:r>
+      <w:bookmarkEnd w:id="5"/>
     </w:p>
     <w:p>
       <w:pPr>
@@ -1787,13 +2789,14 @@
         </w:rPr>
         <w:t xml:space="preserve">Player also manages the facing direction. Pressing left or right updates the facing </w:t>
       </w:r>
+      <w:proofErr w:type="spellStart"/>
       <w:r>
         <w:rPr>
           <w:rFonts w:ascii="Times New Roman" w:eastAsia="Arial" w:hAnsi="Times New Roman" w:cs="Times New Roman"/>
           <w:sz w:val="24"/>
           <w:szCs w:val="24"/>
         </w:rPr>
-        <w:t>Enum to be</w:t>
+        <w:t>e</w:t>
       </w:r>
       <w:r>
         <w:rPr>
@@ -1801,23 +2804,52 @@
           <w:sz w:val="24"/>
           <w:szCs w:val="24"/>
         </w:rPr>
-        <w:t xml:space="preserve"> (Direction::LEFT or Direction::RIGHT), but only if the current state allows it</w:t>
-      </w:r>
+        <w:t>num</w:t>
+      </w:r>
+      <w:proofErr w:type="spellEnd"/>
       <w:r>
         <w:rPr>
           <w:rFonts w:ascii="Times New Roman" w:eastAsia="Arial" w:hAnsi="Times New Roman" w:cs="Times New Roman"/>
           <w:sz w:val="24"/>
           <w:szCs w:val="24"/>
         </w:rPr>
-        <w:t>. S</w:t>
-      </w:r>
+        <w:t xml:space="preserve"> to be (</w:t>
+      </w:r>
+      <w:proofErr w:type="gramStart"/>
       <w:r>
         <w:rPr>
           <w:rFonts w:ascii="Times New Roman" w:eastAsia="Arial" w:hAnsi="Times New Roman" w:cs="Times New Roman"/>
           <w:sz w:val="24"/>
           <w:szCs w:val="24"/>
         </w:rPr>
-        <w:t>tates like Slide, Jump, Fall, WallSlide, WallJump, and Climb lock the facing direction so it can't be changed mid-animation.</w:t>
+        <w:t>Direction::</w:t>
+      </w:r>
+      <w:proofErr w:type="gramEnd"/>
+      <w:r>
+        <w:rPr>
+          <w:rFonts w:ascii="Times New Roman" w:eastAsia="Arial" w:hAnsi="Times New Roman" w:cs="Times New Roman"/>
+          <w:sz w:val="24"/>
+          <w:szCs w:val="24"/>
+        </w:rPr>
+        <w:t xml:space="preserve">LEFT or </w:t>
+      </w:r>
+      <w:proofErr w:type="gramStart"/>
+      <w:r>
+        <w:rPr>
+          <w:rFonts w:ascii="Times New Roman" w:eastAsia="Arial" w:hAnsi="Times New Roman" w:cs="Times New Roman"/>
+          <w:sz w:val="24"/>
+          <w:szCs w:val="24"/>
+        </w:rPr>
+        <w:t>Direction::</w:t>
+      </w:r>
+      <w:proofErr w:type="gramEnd"/>
+      <w:r>
+        <w:rPr>
+          <w:rFonts w:ascii="Times New Roman" w:eastAsia="Arial" w:hAnsi="Times New Roman" w:cs="Times New Roman"/>
+          <w:sz w:val="24"/>
+          <w:szCs w:val="24"/>
+        </w:rPr>
+        <w:t>RIGHT), but only if the current state allows it. States like Slide, Jump, Fall, WallSlide, WallJump, and Climb lock the facing direction so it can't be changed mid-animation.</w:t>
       </w:r>
     </w:p>
     <w:p>
@@ -1863,41 +2895,55 @@
           <w:rFonts w:ascii="Times New Roman" w:hAnsi="Times New Roman" w:cs="Times New Roman"/>
         </w:rPr>
       </w:pPr>
-      <w:r>
-        <w:rPr>
-          <w:rFonts w:ascii="Times New Roman" w:hAnsi="Times New Roman" w:cs="Times New Roman"/>
-        </w:rPr>
-        <w:t>Position</w:t>
-      </w:r>
-      <w:r>
-        <w:rPr>
-          <w:rFonts w:ascii="Times New Roman" w:hAnsi="Times New Roman" w:cs="Times New Roman"/>
-        </w:rPr>
-        <w:t>ing</w:t>
-      </w:r>
+      <w:bookmarkStart w:id="6" w:name="_Toc226834692"/>
+      <w:r>
+        <w:rPr>
+          <w:rFonts w:ascii="Times New Roman" w:hAnsi="Times New Roman" w:cs="Times New Roman"/>
+        </w:rPr>
+        <w:t>Positioning</w:t>
+      </w:r>
+      <w:bookmarkEnd w:id="6"/>
     </w:p>
     <w:p>
       <w:pPr>
         <w:spacing w:before="60" w:after="60"/>
         <w:rPr>
           <w:rFonts w:ascii="Times New Roman" w:eastAsia="Arial" w:hAnsi="Times New Roman" w:cs="Times New Roman"/>
-        </w:rPr>
-      </w:pPr>
+          <w:sz w:val="24"/>
+          <w:szCs w:val="24"/>
+        </w:rPr>
+      </w:pPr>
+      <w:proofErr w:type="gramStart"/>
       <w:r>
         <w:rPr>
           <w:rFonts w:ascii="Times New Roman" w:eastAsia="Arial" w:hAnsi="Times New Roman" w:cs="Times New Roman"/>
-        </w:rPr>
-        <w:t xml:space="preserve">update() also keeps the collider, body sprite, and health bar positions in sync with the </w:t>
-      </w:r>
+          <w:sz w:val="24"/>
+          <w:szCs w:val="24"/>
+        </w:rPr>
+        <w:t>update(</w:t>
+      </w:r>
+      <w:proofErr w:type="gramEnd"/>
       <w:r>
         <w:rPr>
           <w:rFonts w:ascii="Times New Roman" w:eastAsia="Arial" w:hAnsi="Times New Roman" w:cs="Times New Roman"/>
+          <w:sz w:val="24"/>
+          <w:szCs w:val="24"/>
+        </w:rPr>
+        <w:t xml:space="preserve">) also keeps the collider, body sprite, and health bar positions in sync with the </w:t>
+      </w:r>
+      <w:r>
+        <w:rPr>
+          <w:rFonts w:ascii="Times New Roman" w:eastAsia="Arial" w:hAnsi="Times New Roman" w:cs="Times New Roman"/>
+          <w:sz w:val="24"/>
+          <w:szCs w:val="24"/>
         </w:rPr>
         <w:t>players</w:t>
       </w:r>
       <w:r>
         <w:rPr>
           <w:rFonts w:ascii="Times New Roman" w:eastAsia="Arial" w:hAnsi="Times New Roman" w:cs="Times New Roman"/>
+          <w:sz w:val="24"/>
+          <w:szCs w:val="24"/>
         </w:rPr>
         <w:t xml:space="preserve"> position vector each frame, since position is what all the physics and state logic writes to.</w:t>
       </w:r>
@@ -1932,7 +2978,7 @@
           <w:szCs w:val="40"/>
         </w:rPr>
       </w:pPr>
-      <w:bookmarkStart w:id="3" w:name="_Toc226741965"/>
+      <w:bookmarkStart w:id="7" w:name="_Toc226834693"/>
       <w:r>
         <w:rPr>
           <w:rFonts w:ascii="Times New Roman" w:hAnsi="Times New Roman" w:cs="Times New Roman"/>
@@ -1941,7 +2987,7 @@
         </w:rPr>
         <w:t>Enemy</w:t>
       </w:r>
-      <w:bookmarkEnd w:id="3"/>
+      <w:bookmarkEnd w:id="7"/>
     </w:p>
     <w:p>
       <w:pPr>
@@ -1976,12 +3022,14 @@
           <w:rFonts w:ascii="Times New Roman" w:hAnsi="Times New Roman" w:cs="Times New Roman"/>
         </w:rPr>
       </w:pPr>
+      <w:bookmarkStart w:id="8" w:name="_Toc226834694"/>
       <w:r>
         <w:rPr>
           <w:rFonts w:ascii="Times New Roman" w:eastAsia="Arial" w:hAnsi="Times New Roman" w:cs="Times New Roman"/>
         </w:rPr>
         <w:t>Texture Override</w:t>
       </w:r>
+      <w:bookmarkEnd w:id="8"/>
     </w:p>
     <w:p>
       <w:pPr>
@@ -1998,7 +3046,43 @@
           <w:sz w:val="24"/>
           <w:szCs w:val="24"/>
         </w:rPr>
-        <w:t>Enemy overrides loadMovementTextures() and loadCombatTextures() to load from the ENEMY folder instead of the PLAYER folder. Everything else about how textures and animations work is inherited from Entity unchanged.</w:t>
+        <w:t xml:space="preserve">Enemy overrides </w:t>
+      </w:r>
+      <w:proofErr w:type="gramStart"/>
+      <w:r>
+        <w:rPr>
+          <w:rFonts w:ascii="Times New Roman" w:eastAsia="Arial" w:hAnsi="Times New Roman" w:cs="Times New Roman"/>
+          <w:sz w:val="24"/>
+          <w:szCs w:val="24"/>
+        </w:rPr>
+        <w:t>loadMovementTextures(</w:t>
+      </w:r>
+      <w:proofErr w:type="gramEnd"/>
+      <w:r>
+        <w:rPr>
+          <w:rFonts w:ascii="Times New Roman" w:eastAsia="Arial" w:hAnsi="Times New Roman" w:cs="Times New Roman"/>
+          <w:sz w:val="24"/>
+          <w:szCs w:val="24"/>
+        </w:rPr>
+        <w:t xml:space="preserve">) and </w:t>
+      </w:r>
+      <w:proofErr w:type="gramStart"/>
+      <w:r>
+        <w:rPr>
+          <w:rFonts w:ascii="Times New Roman" w:eastAsia="Arial" w:hAnsi="Times New Roman" w:cs="Times New Roman"/>
+          <w:sz w:val="24"/>
+          <w:szCs w:val="24"/>
+        </w:rPr>
+        <w:t>loadCombatTextures(</w:t>
+      </w:r>
+      <w:proofErr w:type="gramEnd"/>
+      <w:r>
+        <w:rPr>
+          <w:rFonts w:ascii="Times New Roman" w:eastAsia="Arial" w:hAnsi="Times New Roman" w:cs="Times New Roman"/>
+          <w:sz w:val="24"/>
+          <w:szCs w:val="24"/>
+        </w:rPr>
+        <w:t>) to load from the ENEMY folder instead of the PLAYER folder. Everything else about how textures and animations work is inherited from Entity unchanged.</w:t>
       </w:r>
     </w:p>
     <w:p>
@@ -2020,6 +3104,7 @@
           <w:szCs w:val="24"/>
         </w:rPr>
       </w:pPr>
+      <w:bookmarkStart w:id="9" w:name="_Toc226834695"/>
       <w:r>
         <w:rPr>
           <w:rStyle w:val="Heading3Char"/>
@@ -2027,6 +3112,7 @@
         </w:rPr>
         <w:t>Sensor system</w:t>
       </w:r>
+      <w:bookmarkEnd w:id="9"/>
       <w:r>
         <w:rPr>
           <w:rFonts w:ascii="Times New Roman" w:hAnsi="Times New Roman" w:cs="Times New Roman"/>
@@ -2067,15 +3153,7 @@
           <w:sz w:val="24"/>
           <w:szCs w:val="24"/>
         </w:rPr>
-        <w:t xml:space="preserve"> </w:t>
-      </w:r>
-      <w:r>
-        <w:rPr>
-          <w:rFonts w:ascii="Times New Roman" w:hAnsi="Times New Roman" w:cs="Times New Roman"/>
-          <w:sz w:val="24"/>
-          <w:szCs w:val="24"/>
-        </w:rPr>
-        <w:t>allow environmental awareness for navigation decisions (jumping gaps, crouching under obstacles</w:t>
+        <w:t xml:space="preserve"> allow environmental awareness for navigation decisions (jumping gaps, crouching under obstacles</w:t>
       </w:r>
       <w:r>
         <w:rPr>
@@ -2192,12 +3270,14 @@
           <w:rFonts w:ascii="Times New Roman" w:hAnsi="Times New Roman" w:cs="Times New Roman"/>
         </w:rPr>
       </w:pPr>
+      <w:bookmarkStart w:id="10" w:name="_Toc226834696"/>
       <w:r>
         <w:rPr>
           <w:rFonts w:ascii="Times New Roman" w:hAnsi="Times New Roman" w:cs="Times New Roman"/>
         </w:rPr>
         <w:t>AI State</w:t>
       </w:r>
+      <w:bookmarkEnd w:id="10"/>
     </w:p>
     <w:p>
       <w:pPr>
@@ -2349,15 +3429,33 @@
           <w:sz w:val="24"/>
           <w:szCs w:val="24"/>
         </w:rPr>
-        <w:t>If the player is not on the same level as them (</w:t>
-      </w:r>
-      <w:r>
-        <w:rPr>
-          <w:rFonts w:ascii="Times New Roman" w:hAnsi="Times New Roman" w:cs="Times New Roman"/>
-          <w:sz w:val="24"/>
-          <w:szCs w:val="24"/>
-        </w:rPr>
-        <w:t xml:space="preserve"> Y position </w:t>
+        <w:t xml:space="preserve">If the player is not on the same level as them </w:t>
+      </w:r>
+      <w:proofErr w:type="gramStart"/>
+      <w:r>
+        <w:rPr>
+          <w:rFonts w:ascii="Times New Roman" w:hAnsi="Times New Roman" w:cs="Times New Roman"/>
+          <w:sz w:val="24"/>
+          <w:szCs w:val="24"/>
+        </w:rPr>
+        <w:t>(</w:t>
+      </w:r>
+      <w:r>
+        <w:rPr>
+          <w:rFonts w:ascii="Times New Roman" w:hAnsi="Times New Roman" w:cs="Times New Roman"/>
+          <w:sz w:val="24"/>
+          <w:szCs w:val="24"/>
+        </w:rPr>
+        <w:t xml:space="preserve"> Y</w:t>
+      </w:r>
+      <w:proofErr w:type="gramEnd"/>
+      <w:r>
+        <w:rPr>
+          <w:rFonts w:ascii="Times New Roman" w:hAnsi="Times New Roman" w:cs="Times New Roman"/>
+          <w:sz w:val="24"/>
+          <w:szCs w:val="24"/>
+        </w:rPr>
+        <w:t xml:space="preserve"> position </w:t>
       </w:r>
       <w:r>
         <w:rPr>
@@ -2479,10 +3577,12 @@
       <w:pPr>
         <w:pStyle w:val="Heading3"/>
       </w:pPr>
+      <w:bookmarkStart w:id="11" w:name="_Toc226834697"/>
       <w:r>
         <w:lastRenderedPageBreak/>
         <w:t>Fuzzy Logic</w:t>
       </w:r>
+      <w:bookmarkEnd w:id="11"/>
     </w:p>
     <w:p>
       <w:pPr>
@@ -2530,7 +3630,25 @@
           <w:sz w:val="24"/>
           <w:szCs w:val="24"/>
         </w:rPr>
-        <w:t xml:space="preserve"> - returns 1.0 at a distance of 60 or less, fades to 0 at 80</w:t>
+        <w:t xml:space="preserve"> - returns 1.0 at </w:t>
+      </w:r>
+      <w:proofErr w:type="gramStart"/>
+      <w:r>
+        <w:rPr>
+          <w:rFonts w:ascii="Times New Roman" w:hAnsi="Times New Roman" w:cs="Times New Roman"/>
+          <w:sz w:val="24"/>
+          <w:szCs w:val="24"/>
+        </w:rPr>
+        <w:t>a distance of 60</w:t>
+      </w:r>
+      <w:proofErr w:type="gramEnd"/>
+      <w:r>
+        <w:rPr>
+          <w:rFonts w:ascii="Times New Roman" w:hAnsi="Times New Roman" w:cs="Times New Roman"/>
+          <w:sz w:val="24"/>
+          <w:szCs w:val="24"/>
+        </w:rPr>
+        <w:t xml:space="preserve"> or less, fades to 0 at 80</w:t>
       </w:r>
     </w:p>
     <w:p>
@@ -2692,23 +3810,7 @@
           <w:sz w:val="24"/>
           <w:szCs w:val="24"/>
         </w:rPr>
-        <w:t xml:space="preserve"> the same move </w:t>
-      </w:r>
-      <w:r>
-        <w:rPr>
-          <w:rFonts w:ascii="Times New Roman" w:hAnsi="Times New Roman" w:cs="Times New Roman"/>
-          <w:sz w:val="24"/>
-          <w:szCs w:val="24"/>
-        </w:rPr>
-        <w:t>repeatedly</w:t>
-      </w:r>
-      <w:r>
-        <w:rPr>
-          <w:rFonts w:ascii="Times New Roman" w:hAnsi="Times New Roman" w:cs="Times New Roman"/>
-          <w:sz w:val="24"/>
-          <w:szCs w:val="24"/>
-        </w:rPr>
-        <w:t xml:space="preserve">. </w:t>
+        <w:t xml:space="preserve"> the same move repeatedly. </w:t>
       </w:r>
     </w:p>
     <w:p>
@@ -2737,7 +3839,7 @@
           <w:szCs w:val="40"/>
         </w:rPr>
       </w:pPr>
-      <w:bookmarkStart w:id="4" w:name="_Toc226741966"/>
+      <w:bookmarkStart w:id="12" w:name="_Toc226834698"/>
       <w:r>
         <w:rPr>
           <w:rFonts w:ascii="Times New Roman" w:hAnsi="Times New Roman" w:cs="Times New Roman"/>
@@ -2747,7 +3849,7 @@
         <w:lastRenderedPageBreak/>
         <w:t>The State Machine</w:t>
       </w:r>
-      <w:bookmarkEnd w:id="4"/>
+      <w:bookmarkEnd w:id="12"/>
     </w:p>
     <w:p>
       <w:pPr>
@@ -2760,7 +3862,35 @@
         <w:rPr>
           <w:rFonts w:ascii="Times New Roman" w:eastAsia="Arial" w:hAnsi="Times New Roman" w:cs="Times New Roman"/>
         </w:rPr>
-        <w:t>StateMachine is a simple abstract base class with two pure virtual methods: enter() and update(). Every movement and combat state inherits from it and implements both.</w:t>
+        <w:t xml:space="preserve">StateMachine is a simple abstract base class with two pure virtual methods: </w:t>
+      </w:r>
+      <w:proofErr w:type="gramStart"/>
+      <w:r>
+        <w:rPr>
+          <w:rFonts w:ascii="Times New Roman" w:eastAsia="Arial" w:hAnsi="Times New Roman" w:cs="Times New Roman"/>
+        </w:rPr>
+        <w:t>enter(</w:t>
+      </w:r>
+      <w:proofErr w:type="gramEnd"/>
+      <w:r>
+        <w:rPr>
+          <w:rFonts w:ascii="Times New Roman" w:eastAsia="Arial" w:hAnsi="Times New Roman" w:cs="Times New Roman"/>
+        </w:rPr>
+        <w:t xml:space="preserve">) and </w:t>
+      </w:r>
+      <w:proofErr w:type="gramStart"/>
+      <w:r>
+        <w:rPr>
+          <w:rFonts w:ascii="Times New Roman" w:eastAsia="Arial" w:hAnsi="Times New Roman" w:cs="Times New Roman"/>
+        </w:rPr>
+        <w:t>update(</w:t>
+      </w:r>
+      <w:proofErr w:type="gramEnd"/>
+      <w:r>
+        <w:rPr>
+          <w:rFonts w:ascii="Times New Roman" w:eastAsia="Arial" w:hAnsi="Times New Roman" w:cs="Times New Roman"/>
+        </w:rPr>
+        <w:t>). Every movement and combat state inherits from it and implements both.</w:t>
       </w:r>
     </w:p>
     <w:p>
@@ -2785,29 +3915,23 @@
           <w:szCs w:val="24"/>
         </w:rPr>
       </w:pPr>
+      <w:proofErr w:type="gramStart"/>
       <w:r>
         <w:rPr>
           <w:rFonts w:ascii="Times New Roman" w:eastAsia="Arial" w:hAnsi="Times New Roman" w:cs="Times New Roman"/>
           <w:sz w:val="24"/>
           <w:szCs w:val="24"/>
         </w:rPr>
-        <w:t xml:space="preserve">enter() is called once when transitioning into the state </w:t>
-      </w:r>
+        <w:t>enter(</w:t>
+      </w:r>
+      <w:proofErr w:type="gramEnd"/>
       <w:r>
         <w:rPr>
           <w:rFonts w:ascii="Times New Roman" w:eastAsia="Arial" w:hAnsi="Times New Roman" w:cs="Times New Roman"/>
           <w:sz w:val="24"/>
           <w:szCs w:val="24"/>
         </w:rPr>
-        <w:t>-</w:t>
-      </w:r>
-      <w:r>
-        <w:rPr>
-          <w:rFonts w:ascii="Times New Roman" w:eastAsia="Arial" w:hAnsi="Times New Roman" w:cs="Times New Roman"/>
-          <w:sz w:val="24"/>
-          <w:szCs w:val="24"/>
-        </w:rPr>
-        <w:t xml:space="preserve"> it sets the correct texture, resets the frame counter, and does any one-time setup like setting initial velocity. </w:t>
+        <w:t xml:space="preserve">) is called once when transitioning into the state - it sets the correct texture, resets the frame counter, and does any one-time setup like setting initial velocity. </w:t>
       </w:r>
     </w:p>
     <w:p>
@@ -2835,13 +3959,23 @@
           <w:szCs w:val="24"/>
         </w:rPr>
       </w:pPr>
+      <w:proofErr w:type="gramStart"/>
       <w:r>
         <w:rPr>
           <w:rFonts w:ascii="Times New Roman" w:eastAsia="Arial" w:hAnsi="Times New Roman" w:cs="Times New Roman"/>
           <w:sz w:val="24"/>
           <w:szCs w:val="24"/>
         </w:rPr>
-        <w:t>update() is called every frame while that state is active and handles movement, animation, and checking whether to transition to another state.</w:t>
+        <w:t>update(</w:t>
+      </w:r>
+      <w:proofErr w:type="gramEnd"/>
+      <w:r>
+        <w:rPr>
+          <w:rFonts w:ascii="Times New Roman" w:eastAsia="Arial" w:hAnsi="Times New Roman" w:cs="Times New Roman"/>
+          <w:sz w:val="24"/>
+          <w:szCs w:val="24"/>
+        </w:rPr>
+        <w:t>) is called every frame while that state is active and handles movement, animation, and checking whether to transition to another state.</w:t>
       </w:r>
     </w:p>
     <w:p>
@@ -2884,13 +4018,59 @@
         </w:rPr>
         <w:t xml:space="preserve"> the entities </w:t>
       </w:r>
+      <w:proofErr w:type="gramStart"/>
       <w:r>
         <w:rPr>
           <w:rFonts w:ascii="Times New Roman" w:eastAsia="Arial" w:hAnsi="Times New Roman" w:cs="Times New Roman"/>
           <w:sz w:val="24"/>
           <w:szCs w:val="24"/>
         </w:rPr>
-        <w:t>setStates() and stored as pointers on the Entity. changeState() switches the current state by calling enter() on the new one and resetting currentFrame to 0.</w:t>
+        <w:t>setStates(</w:t>
+      </w:r>
+      <w:proofErr w:type="gramEnd"/>
+      <w:r>
+        <w:rPr>
+          <w:rFonts w:ascii="Times New Roman" w:eastAsia="Arial" w:hAnsi="Times New Roman" w:cs="Times New Roman"/>
+          <w:sz w:val="24"/>
+          <w:szCs w:val="24"/>
+        </w:rPr>
+        <w:t xml:space="preserve">) and stored as pointers on the Entity. </w:t>
+      </w:r>
+      <w:proofErr w:type="gramStart"/>
+      <w:r>
+        <w:rPr>
+          <w:rFonts w:ascii="Times New Roman" w:eastAsia="Arial" w:hAnsi="Times New Roman" w:cs="Times New Roman"/>
+          <w:sz w:val="24"/>
+          <w:szCs w:val="24"/>
+        </w:rPr>
+        <w:t>changeState(</w:t>
+      </w:r>
+      <w:proofErr w:type="gramEnd"/>
+      <w:r>
+        <w:rPr>
+          <w:rFonts w:ascii="Times New Roman" w:eastAsia="Arial" w:hAnsi="Times New Roman" w:cs="Times New Roman"/>
+          <w:sz w:val="24"/>
+          <w:szCs w:val="24"/>
+        </w:rPr>
+        <w:t xml:space="preserve">) switches the current state by calling </w:t>
+      </w:r>
+      <w:proofErr w:type="gramStart"/>
+      <w:r>
+        <w:rPr>
+          <w:rFonts w:ascii="Times New Roman" w:eastAsia="Arial" w:hAnsi="Times New Roman" w:cs="Times New Roman"/>
+          <w:sz w:val="24"/>
+          <w:szCs w:val="24"/>
+        </w:rPr>
+        <w:t>enter(</w:t>
+      </w:r>
+      <w:proofErr w:type="gramEnd"/>
+      <w:r>
+        <w:rPr>
+          <w:rFonts w:ascii="Times New Roman" w:eastAsia="Arial" w:hAnsi="Times New Roman" w:cs="Times New Roman"/>
+          <w:sz w:val="24"/>
+          <w:szCs w:val="24"/>
+        </w:rPr>
+        <w:t>) on the new one and resetting currentFrame to 0.</w:t>
       </w:r>
     </w:p>
     <w:p>
@@ -2927,135 +4107,650 @@
     </w:p>
     <w:p>
       <w:pPr>
+        <w:pStyle w:val="Heading3"/>
+        <w:rPr>
+          <w:rFonts w:ascii="Times New Roman" w:hAnsi="Times New Roman" w:cs="Times New Roman"/>
+        </w:rPr>
+      </w:pPr>
+      <w:bookmarkStart w:id="13" w:name="_Toc226834699"/>
+      <w:r>
+        <w:rPr>
+          <w:rFonts w:ascii="Times New Roman" w:hAnsi="Times New Roman" w:cs="Times New Roman"/>
+        </w:rPr>
+        <w:t>Movement States</w:t>
+      </w:r>
+      <w:bookmarkEnd w:id="13"/>
+    </w:p>
+    <w:p>
+      <w:pPr>
+        <w:pStyle w:val="ListParagraph"/>
+        <w:numPr>
+          <w:ilvl w:val="0"/>
+          <w:numId w:val="12"/>
+        </w:numPr>
+        <w:rPr>
+          <w:rFonts w:ascii="Times New Roman" w:eastAsiaTheme="majorEastAsia" w:hAnsi="Times New Roman" w:cs="Times New Roman"/>
+          <w:sz w:val="24"/>
+          <w:szCs w:val="24"/>
+        </w:rPr>
+      </w:pPr>
+      <w:r>
+        <w:rPr>
+          <w:rFonts w:ascii="Times New Roman" w:eastAsiaTheme="majorEastAsia" w:hAnsi="Times New Roman" w:cs="Times New Roman"/>
+          <w:sz w:val="24"/>
+          <w:szCs w:val="24"/>
+        </w:rPr>
+        <w:t xml:space="preserve">Idle </w:t>
+      </w:r>
+      <w:r>
+        <w:rPr>
+          <w:rFonts w:ascii="Times New Roman" w:eastAsiaTheme="majorEastAsia" w:hAnsi="Times New Roman" w:cs="Times New Roman"/>
+          <w:sz w:val="24"/>
+          <w:szCs w:val="24"/>
+        </w:rPr>
+        <w:t xml:space="preserve">- </w:t>
+      </w:r>
+      <w:r>
+        <w:rPr>
+          <w:rFonts w:ascii="Times New Roman" w:eastAsiaTheme="majorEastAsia" w:hAnsi="Times New Roman" w:cs="Times New Roman"/>
+          <w:sz w:val="24"/>
+          <w:szCs w:val="24"/>
+        </w:rPr>
+        <w:t>loops idle animation, transitions to walk/run/crouch/jump/punch/block</w:t>
+      </w:r>
+    </w:p>
+    <w:p>
+      <w:pPr>
+        <w:pStyle w:val="ListParagraph"/>
+        <w:numPr>
+          <w:ilvl w:val="0"/>
+          <w:numId w:val="12"/>
+        </w:numPr>
+        <w:rPr>
+          <w:rFonts w:ascii="Times New Roman" w:eastAsiaTheme="majorEastAsia" w:hAnsi="Times New Roman" w:cs="Times New Roman"/>
+          <w:sz w:val="24"/>
+          <w:szCs w:val="24"/>
+        </w:rPr>
+      </w:pPr>
+      <w:r>
+        <w:rPr>
+          <w:rFonts w:ascii="Times New Roman" w:eastAsiaTheme="majorEastAsia" w:hAnsi="Times New Roman" w:cs="Times New Roman"/>
+          <w:sz w:val="24"/>
+          <w:szCs w:val="24"/>
+        </w:rPr>
+        <w:t xml:space="preserve">Walk </w:t>
+      </w:r>
+      <w:r>
+        <w:rPr>
+          <w:rFonts w:ascii="Times New Roman" w:eastAsiaTheme="majorEastAsia" w:hAnsi="Times New Roman" w:cs="Times New Roman"/>
+          <w:sz w:val="24"/>
+          <w:szCs w:val="24"/>
+        </w:rPr>
+        <w:t>-</w:t>
+      </w:r>
+      <w:r>
+        <w:rPr>
+          <w:rFonts w:ascii="Times New Roman" w:eastAsiaTheme="majorEastAsia" w:hAnsi="Times New Roman" w:cs="Times New Roman"/>
+          <w:sz w:val="24"/>
+          <w:szCs w:val="24"/>
+        </w:rPr>
+        <w:t xml:space="preserve"> moves at speed 3, switches texture each frame based on facing direction</w:t>
+      </w:r>
+    </w:p>
+    <w:p>
+      <w:pPr>
+        <w:pStyle w:val="ListParagraph"/>
+        <w:numPr>
+          <w:ilvl w:val="0"/>
+          <w:numId w:val="12"/>
+        </w:numPr>
+        <w:rPr>
+          <w:rFonts w:ascii="Times New Roman" w:eastAsiaTheme="majorEastAsia" w:hAnsi="Times New Roman" w:cs="Times New Roman"/>
+          <w:sz w:val="24"/>
+          <w:szCs w:val="24"/>
+        </w:rPr>
+      </w:pPr>
+      <w:r>
+        <w:rPr>
+          <w:rFonts w:ascii="Times New Roman" w:eastAsiaTheme="majorEastAsia" w:hAnsi="Times New Roman" w:cs="Times New Roman"/>
+          <w:sz w:val="24"/>
+          <w:szCs w:val="24"/>
+        </w:rPr>
+        <w:t xml:space="preserve">Run </w:t>
+      </w:r>
+      <w:r>
+        <w:rPr>
+          <w:rFonts w:ascii="Times New Roman" w:eastAsiaTheme="majorEastAsia" w:hAnsi="Times New Roman" w:cs="Times New Roman"/>
+          <w:sz w:val="24"/>
+          <w:szCs w:val="24"/>
+        </w:rPr>
+        <w:t>-</w:t>
+      </w:r>
+      <w:r>
+        <w:rPr>
+          <w:rFonts w:ascii="Times New Roman" w:eastAsiaTheme="majorEastAsia" w:hAnsi="Times New Roman" w:cs="Times New Roman"/>
+          <w:sz w:val="24"/>
+          <w:szCs w:val="24"/>
+        </w:rPr>
+        <w:t xml:space="preserve"> moves at speed 15, can transition to slide if crouching</w:t>
+      </w:r>
+    </w:p>
+    <w:p>
+      <w:pPr>
+        <w:pStyle w:val="ListParagraph"/>
+        <w:numPr>
+          <w:ilvl w:val="0"/>
+          <w:numId w:val="12"/>
+        </w:numPr>
+        <w:rPr>
+          <w:rFonts w:ascii="Times New Roman" w:eastAsiaTheme="majorEastAsia" w:hAnsi="Times New Roman" w:cs="Times New Roman"/>
+          <w:sz w:val="24"/>
+          <w:szCs w:val="24"/>
+        </w:rPr>
+      </w:pPr>
+      <w:r>
+        <w:rPr>
+          <w:rFonts w:ascii="Times New Roman" w:eastAsiaTheme="majorEastAsia" w:hAnsi="Times New Roman" w:cs="Times New Roman"/>
+          <w:sz w:val="24"/>
+          <w:szCs w:val="24"/>
+        </w:rPr>
+        <w:t xml:space="preserve">Jump </w:t>
+      </w:r>
+      <w:r>
+        <w:rPr>
+          <w:rFonts w:ascii="Times New Roman" w:eastAsiaTheme="majorEastAsia" w:hAnsi="Times New Roman" w:cs="Times New Roman"/>
+          <w:sz w:val="24"/>
+          <w:szCs w:val="24"/>
+        </w:rPr>
+        <w:t>-</w:t>
+      </w:r>
+      <w:r>
+        <w:rPr>
+          <w:rFonts w:ascii="Times New Roman" w:eastAsiaTheme="majorEastAsia" w:hAnsi="Times New Roman" w:cs="Times New Roman"/>
+          <w:sz w:val="24"/>
+          <w:szCs w:val="24"/>
+        </w:rPr>
+        <w:t xml:space="preserve"> carries horizontal velocity into the air, transitions to falling when vertical velocity goes positive</w:t>
+      </w:r>
+    </w:p>
+    <w:p>
+      <w:pPr>
+        <w:pStyle w:val="ListParagraph"/>
+        <w:numPr>
+          <w:ilvl w:val="0"/>
+          <w:numId w:val="12"/>
+        </w:numPr>
+        <w:rPr>
+          <w:rFonts w:ascii="Times New Roman" w:eastAsiaTheme="majorEastAsia" w:hAnsi="Times New Roman" w:cs="Times New Roman"/>
+          <w:sz w:val="24"/>
+          <w:szCs w:val="24"/>
+        </w:rPr>
+      </w:pPr>
+      <w:r>
+        <w:rPr>
+          <w:rFonts w:ascii="Times New Roman" w:eastAsiaTheme="majorEastAsia" w:hAnsi="Times New Roman" w:cs="Times New Roman"/>
+          <w:sz w:val="24"/>
+          <w:szCs w:val="24"/>
+        </w:rPr>
+        <w:t xml:space="preserve">Fall </w:t>
+      </w:r>
+      <w:r>
+        <w:rPr>
+          <w:rFonts w:ascii="Times New Roman" w:eastAsiaTheme="majorEastAsia" w:hAnsi="Times New Roman" w:cs="Times New Roman"/>
+          <w:sz w:val="24"/>
+          <w:szCs w:val="24"/>
+        </w:rPr>
+        <w:t>-</w:t>
+      </w:r>
+      <w:r>
+        <w:rPr>
+          <w:rFonts w:ascii="Times New Roman" w:eastAsiaTheme="majorEastAsia" w:hAnsi="Times New Roman" w:cs="Times New Roman"/>
+          <w:sz w:val="24"/>
+          <w:szCs w:val="24"/>
+        </w:rPr>
+        <w:t xml:space="preserve"> applies gravity each frame, checks for fatal fall transitions to landing on ground contact or drop kick on attack input</w:t>
+      </w:r>
+    </w:p>
+    <w:p>
+      <w:pPr>
+        <w:pStyle w:val="ListParagraph"/>
+        <w:numPr>
+          <w:ilvl w:val="0"/>
+          <w:numId w:val="12"/>
+        </w:numPr>
+        <w:rPr>
+          <w:rFonts w:ascii="Times New Roman" w:eastAsiaTheme="majorEastAsia" w:hAnsi="Times New Roman" w:cs="Times New Roman"/>
+          <w:sz w:val="24"/>
+          <w:szCs w:val="24"/>
+        </w:rPr>
+      </w:pPr>
+      <w:r>
+        <w:rPr>
+          <w:rFonts w:ascii="Times New Roman" w:eastAsiaTheme="majorEastAsia" w:hAnsi="Times New Roman" w:cs="Times New Roman"/>
+          <w:sz w:val="24"/>
+          <w:szCs w:val="24"/>
+        </w:rPr>
+        <w:t xml:space="preserve">Land </w:t>
+      </w:r>
+      <w:r>
+        <w:rPr>
+          <w:rFonts w:ascii="Times New Roman" w:eastAsiaTheme="majorEastAsia" w:hAnsi="Times New Roman" w:cs="Times New Roman"/>
+          <w:sz w:val="24"/>
+          <w:szCs w:val="24"/>
+        </w:rPr>
+        <w:t>-</w:t>
+      </w:r>
+      <w:r>
+        <w:rPr>
+          <w:rFonts w:ascii="Times New Roman" w:eastAsiaTheme="majorEastAsia" w:hAnsi="Times New Roman" w:cs="Times New Roman"/>
+          <w:sz w:val="24"/>
+          <w:szCs w:val="24"/>
+        </w:rPr>
+        <w:t xml:space="preserve"> plays a short landing animation then returns to idle or walk</w:t>
+      </w:r>
+    </w:p>
+    <w:p>
+      <w:pPr>
+        <w:pStyle w:val="ListParagraph"/>
+        <w:numPr>
+          <w:ilvl w:val="0"/>
+          <w:numId w:val="12"/>
+        </w:numPr>
+        <w:rPr>
+          <w:rFonts w:ascii="Times New Roman" w:eastAsiaTheme="majorEastAsia" w:hAnsi="Times New Roman" w:cs="Times New Roman"/>
+          <w:sz w:val="24"/>
+          <w:szCs w:val="24"/>
+        </w:rPr>
+      </w:pPr>
+      <w:r>
+        <w:rPr>
+          <w:rFonts w:ascii="Times New Roman" w:eastAsiaTheme="majorEastAsia" w:hAnsi="Times New Roman" w:cs="Times New Roman"/>
+          <w:sz w:val="24"/>
+          <w:szCs w:val="24"/>
+        </w:rPr>
+        <w:t xml:space="preserve">CrouchIdle </w:t>
+      </w:r>
+      <w:r>
+        <w:rPr>
+          <w:rFonts w:ascii="Times New Roman" w:eastAsiaTheme="majorEastAsia" w:hAnsi="Times New Roman" w:cs="Times New Roman"/>
+          <w:sz w:val="24"/>
+          <w:szCs w:val="24"/>
+        </w:rPr>
+        <w:t>-</w:t>
+      </w:r>
+      <w:r>
+        <w:rPr>
+          <w:rFonts w:ascii="Times New Roman" w:eastAsiaTheme="majorEastAsia" w:hAnsi="Times New Roman" w:cs="Times New Roman"/>
+          <w:sz w:val="24"/>
+          <w:szCs w:val="24"/>
+        </w:rPr>
+        <w:t xml:space="preserve"> collider scaled to 60% height, transitions to crouch walk or stand up</w:t>
+      </w:r>
+    </w:p>
+    <w:p>
+      <w:pPr>
+        <w:pStyle w:val="ListParagraph"/>
+        <w:numPr>
+          <w:ilvl w:val="0"/>
+          <w:numId w:val="12"/>
+        </w:numPr>
+        <w:rPr>
+          <w:rFonts w:ascii="Times New Roman" w:eastAsiaTheme="majorEastAsia" w:hAnsi="Times New Roman" w:cs="Times New Roman"/>
+          <w:sz w:val="24"/>
+          <w:szCs w:val="24"/>
+        </w:rPr>
+      </w:pPr>
+      <w:r>
+        <w:rPr>
+          <w:rFonts w:ascii="Times New Roman" w:eastAsiaTheme="majorEastAsia" w:hAnsi="Times New Roman" w:cs="Times New Roman"/>
+          <w:sz w:val="24"/>
+          <w:szCs w:val="24"/>
+        </w:rPr>
+        <w:t xml:space="preserve">CrouchWalk </w:t>
+      </w:r>
+      <w:r>
+        <w:rPr>
+          <w:rFonts w:ascii="Times New Roman" w:eastAsiaTheme="majorEastAsia" w:hAnsi="Times New Roman" w:cs="Times New Roman"/>
+          <w:sz w:val="24"/>
+          <w:szCs w:val="24"/>
+        </w:rPr>
+        <w:t>-</w:t>
+      </w:r>
+      <w:r>
+        <w:rPr>
+          <w:rFonts w:ascii="Times New Roman" w:eastAsiaTheme="majorEastAsia" w:hAnsi="Times New Roman" w:cs="Times New Roman"/>
+          <w:sz w:val="24"/>
+          <w:szCs w:val="24"/>
+        </w:rPr>
+        <w:t xml:space="preserve"> moves at base speed while crouched</w:t>
+      </w:r>
+    </w:p>
+    <w:p>
+      <w:pPr>
+        <w:pStyle w:val="ListParagraph"/>
+        <w:numPr>
+          <w:ilvl w:val="0"/>
+          <w:numId w:val="12"/>
+        </w:numPr>
+        <w:rPr>
+          <w:rFonts w:ascii="Times New Roman" w:eastAsiaTheme="majorEastAsia" w:hAnsi="Times New Roman" w:cs="Times New Roman"/>
+          <w:sz w:val="24"/>
+          <w:szCs w:val="24"/>
+        </w:rPr>
+      </w:pPr>
+      <w:r>
+        <w:rPr>
+          <w:rFonts w:ascii="Times New Roman" w:eastAsiaTheme="majorEastAsia" w:hAnsi="Times New Roman" w:cs="Times New Roman"/>
+          <w:sz w:val="24"/>
+          <w:szCs w:val="24"/>
+        </w:rPr>
+        <w:t xml:space="preserve">Slide </w:t>
+      </w:r>
+      <w:r>
+        <w:rPr>
+          <w:rFonts w:ascii="Times New Roman" w:eastAsiaTheme="majorEastAsia" w:hAnsi="Times New Roman" w:cs="Times New Roman"/>
+          <w:sz w:val="24"/>
+          <w:szCs w:val="24"/>
+        </w:rPr>
+        <w:t xml:space="preserve">- </w:t>
+      </w:r>
+      <w:r>
+        <w:rPr>
+          <w:rFonts w:ascii="Times New Roman" w:eastAsiaTheme="majorEastAsia" w:hAnsi="Times New Roman" w:cs="Times New Roman"/>
+          <w:sz w:val="24"/>
+          <w:szCs w:val="24"/>
+        </w:rPr>
+        <w:t>decelerating momentum slide, extended hitSensor, transitions to SlideToRun when velocity hits zero</w:t>
+      </w:r>
+    </w:p>
+    <w:p>
+      <w:pPr>
+        <w:pStyle w:val="ListParagraph"/>
+        <w:numPr>
+          <w:ilvl w:val="0"/>
+          <w:numId w:val="12"/>
+        </w:numPr>
+        <w:rPr>
+          <w:rFonts w:ascii="Times New Roman" w:eastAsiaTheme="majorEastAsia" w:hAnsi="Times New Roman" w:cs="Times New Roman"/>
+          <w:sz w:val="24"/>
+          <w:szCs w:val="24"/>
+        </w:rPr>
+      </w:pPr>
+      <w:r>
+        <w:rPr>
+          <w:rFonts w:ascii="Times New Roman" w:eastAsiaTheme="majorEastAsia" w:hAnsi="Times New Roman" w:cs="Times New Roman"/>
+          <w:sz w:val="24"/>
+          <w:szCs w:val="24"/>
+        </w:rPr>
+        <w:t xml:space="preserve">WallSlide </w:t>
+      </w:r>
+      <w:r>
+        <w:rPr>
+          <w:rFonts w:ascii="Times New Roman" w:eastAsiaTheme="majorEastAsia" w:hAnsi="Times New Roman" w:cs="Times New Roman"/>
+          <w:sz w:val="24"/>
+          <w:szCs w:val="24"/>
+        </w:rPr>
+        <w:t>-</w:t>
+      </w:r>
+      <w:r>
+        <w:rPr>
+          <w:rFonts w:ascii="Times New Roman" w:eastAsiaTheme="majorEastAsia" w:hAnsi="Times New Roman" w:cs="Times New Roman"/>
+          <w:sz w:val="24"/>
+          <w:szCs w:val="24"/>
+        </w:rPr>
+        <w:t xml:space="preserve"> slow descent along a wall, reduced gravity, can wall jump</w:t>
+      </w:r>
+    </w:p>
+    <w:p>
+      <w:pPr>
+        <w:pStyle w:val="ListParagraph"/>
+        <w:numPr>
+          <w:ilvl w:val="0"/>
+          <w:numId w:val="12"/>
+        </w:numPr>
+        <w:rPr>
+          <w:rFonts w:ascii="Times New Roman" w:eastAsiaTheme="majorEastAsia" w:hAnsi="Times New Roman" w:cs="Times New Roman"/>
+          <w:sz w:val="24"/>
+          <w:szCs w:val="24"/>
+        </w:rPr>
+      </w:pPr>
+      <w:r>
+        <w:rPr>
+          <w:rFonts w:ascii="Times New Roman" w:eastAsiaTheme="majorEastAsia" w:hAnsi="Times New Roman" w:cs="Times New Roman"/>
+          <w:sz w:val="24"/>
+          <w:szCs w:val="24"/>
+        </w:rPr>
+        <w:t xml:space="preserve">WallJump </w:t>
+      </w:r>
+      <w:r>
+        <w:rPr>
+          <w:rFonts w:ascii="Times New Roman" w:eastAsiaTheme="majorEastAsia" w:hAnsi="Times New Roman" w:cs="Times New Roman"/>
+          <w:sz w:val="24"/>
+          <w:szCs w:val="24"/>
+        </w:rPr>
+        <w:t>-</w:t>
+      </w:r>
+      <w:r>
+        <w:rPr>
+          <w:rFonts w:ascii="Times New Roman" w:eastAsiaTheme="majorEastAsia" w:hAnsi="Times New Roman" w:cs="Times New Roman"/>
+          <w:sz w:val="24"/>
+          <w:szCs w:val="24"/>
+        </w:rPr>
+        <w:t xml:space="preserve"> flips facing direction and launches away from the wall</w:t>
+      </w:r>
+    </w:p>
+    <w:p>
+      <w:pPr>
+        <w:pStyle w:val="ListParagraph"/>
+        <w:numPr>
+          <w:ilvl w:val="0"/>
+          <w:numId w:val="12"/>
+        </w:numPr>
+        <w:rPr>
+          <w:rFonts w:ascii="Times New Roman" w:eastAsiaTheme="majorEastAsia" w:hAnsi="Times New Roman" w:cs="Times New Roman"/>
+          <w:sz w:val="24"/>
+          <w:szCs w:val="24"/>
+        </w:rPr>
+      </w:pPr>
+      <w:r>
+        <w:rPr>
+          <w:rFonts w:ascii="Times New Roman" w:eastAsiaTheme="majorEastAsia" w:hAnsi="Times New Roman" w:cs="Times New Roman"/>
+          <w:sz w:val="24"/>
+          <w:szCs w:val="24"/>
+        </w:rPr>
+        <w:t xml:space="preserve">Climb </w:t>
+      </w:r>
+      <w:r>
+        <w:rPr>
+          <w:rFonts w:ascii="Times New Roman" w:eastAsiaTheme="majorEastAsia" w:hAnsi="Times New Roman" w:cs="Times New Roman"/>
+          <w:sz w:val="24"/>
+          <w:szCs w:val="24"/>
+        </w:rPr>
+        <w:t xml:space="preserve">- </w:t>
+      </w:r>
+      <w:r>
+        <w:rPr>
+          <w:rFonts w:ascii="Times New Roman" w:eastAsiaTheme="majorEastAsia" w:hAnsi="Times New Roman" w:cs="Times New Roman"/>
+          <w:sz w:val="24"/>
+          <w:szCs w:val="24"/>
+        </w:rPr>
+        <w:t>plays a fixed animation that moves the entity up and forward onto the ledge</w:t>
+      </w:r>
+    </w:p>
+    <w:p>
+      <w:pPr>
+        <w:pStyle w:val="ListParagraph"/>
+        <w:rPr>
+          <w:rFonts w:ascii="Times New Roman" w:hAnsi="Times New Roman" w:cs="Times New Roman"/>
+          <w:sz w:val="24"/>
+          <w:szCs w:val="24"/>
+        </w:rPr>
+      </w:pPr>
+    </w:p>
+    <w:p>
+      <w:pPr>
+        <w:pStyle w:val="Heading3"/>
+        <w:rPr>
+          <w:rFonts w:ascii="Times New Roman" w:hAnsi="Times New Roman" w:cs="Times New Roman"/>
+        </w:rPr>
+      </w:pPr>
+      <w:bookmarkStart w:id="14" w:name="_Toc226834700"/>
+      <w:r>
+        <w:rPr>
+          <w:rFonts w:ascii="Times New Roman" w:hAnsi="Times New Roman" w:cs="Times New Roman"/>
+        </w:rPr>
+        <w:t>Transition States</w:t>
+      </w:r>
+      <w:bookmarkEnd w:id="14"/>
+    </w:p>
+    <w:p>
+      <w:pPr>
+        <w:rPr>
+          <w:rFonts w:ascii="Times New Roman" w:eastAsiaTheme="majorEastAsia" w:hAnsi="Times New Roman" w:cs="Times New Roman"/>
+          <w:sz w:val="24"/>
+          <w:szCs w:val="24"/>
+        </w:rPr>
+      </w:pPr>
+      <w:r>
+        <w:rPr>
+          <w:rFonts w:ascii="Times New Roman" w:eastAsiaTheme="majorEastAsia" w:hAnsi="Times New Roman" w:cs="Times New Roman"/>
+          <w:sz w:val="24"/>
+          <w:szCs w:val="24"/>
+        </w:rPr>
+        <w:t xml:space="preserve">Short </w:t>
+      </w:r>
+      <w:r>
+        <w:rPr>
+          <w:rFonts w:ascii="Times New Roman" w:eastAsiaTheme="majorEastAsia" w:hAnsi="Times New Roman" w:cs="Times New Roman"/>
+          <w:sz w:val="24"/>
+          <w:szCs w:val="24"/>
+        </w:rPr>
+        <w:t xml:space="preserve">non-looping </w:t>
+      </w:r>
+      <w:r>
+        <w:rPr>
+          <w:rFonts w:ascii="Times New Roman" w:eastAsiaTheme="majorEastAsia" w:hAnsi="Times New Roman" w:cs="Times New Roman"/>
+          <w:sz w:val="24"/>
+          <w:szCs w:val="24"/>
+        </w:rPr>
+        <w:t>animations between major states. They play through their</w:t>
+      </w:r>
+      <w:r>
+        <w:rPr>
+          <w:rFonts w:eastAsiaTheme="majorEastAsia" w:cstheme="majorBidi"/>
+          <w:sz w:val="28"/>
+          <w:szCs w:val="28"/>
+        </w:rPr>
+        <w:t xml:space="preserve"> </w:t>
+      </w:r>
+      <w:r>
+        <w:rPr>
+          <w:rFonts w:ascii="Times New Roman" w:eastAsiaTheme="majorEastAsia" w:hAnsi="Times New Roman" w:cs="Times New Roman"/>
+          <w:sz w:val="24"/>
+          <w:szCs w:val="24"/>
+        </w:rPr>
+        <w:t>animation and then hand off to their target state</w:t>
+      </w:r>
+      <w:r>
+        <w:rPr>
+          <w:rFonts w:ascii="Times New Roman" w:eastAsiaTheme="majorEastAsia" w:hAnsi="Times New Roman" w:cs="Times New Roman"/>
+          <w:sz w:val="24"/>
+          <w:szCs w:val="24"/>
+        </w:rPr>
+        <w:t>.</w:t>
+      </w:r>
+    </w:p>
+    <w:p>
+      <w:pPr>
+        <w:numPr>
+          <w:ilvl w:val="0"/>
+          <w:numId w:val="12"/>
+        </w:numPr>
+        <w:rPr>
+          <w:rFonts w:ascii="Times New Roman" w:eastAsiaTheme="majorEastAsia" w:hAnsi="Times New Roman" w:cs="Times New Roman"/>
+          <w:sz w:val="24"/>
+          <w:szCs w:val="24"/>
+        </w:rPr>
+      </w:pPr>
+      <w:r>
+        <w:rPr>
+          <w:rFonts w:ascii="Times New Roman" w:eastAsiaTheme="majorEastAsia" w:hAnsi="Times New Roman" w:cs="Times New Roman"/>
+          <w:sz w:val="24"/>
+          <w:szCs w:val="24"/>
+        </w:rPr>
+        <w:t>IdleToWalk, IdleToJump, IdleToCrouch, CrouchToIdle</w:t>
+      </w:r>
+    </w:p>
+    <w:p>
+      <w:pPr>
+        <w:numPr>
+          <w:ilvl w:val="0"/>
+          <w:numId w:val="12"/>
+        </w:numPr>
+        <w:rPr>
+          <w:rFonts w:ascii="Times New Roman" w:eastAsiaTheme="majorEastAsia" w:hAnsi="Times New Roman" w:cs="Times New Roman"/>
+          <w:sz w:val="24"/>
+          <w:szCs w:val="24"/>
+        </w:rPr>
+      </w:pPr>
+      <w:r>
+        <w:rPr>
+          <w:rFonts w:ascii="Times New Roman" w:eastAsiaTheme="majorEastAsia" w:hAnsi="Times New Roman" w:cs="Times New Roman"/>
+          <w:sz w:val="24"/>
+          <w:szCs w:val="24"/>
+        </w:rPr>
+        <w:t>RunToSlide, SlideToRun</w:t>
+      </w:r>
+    </w:p>
+    <w:p>
+      <w:pPr>
+        <w:numPr>
+          <w:ilvl w:val="0"/>
+          <w:numId w:val="12"/>
+        </w:numPr>
+        <w:rPr>
+          <w:rFonts w:ascii="Times New Roman" w:eastAsiaTheme="majorEastAsia" w:hAnsi="Times New Roman" w:cs="Times New Roman"/>
+          <w:sz w:val="24"/>
+          <w:szCs w:val="24"/>
+        </w:rPr>
+      </w:pPr>
+      <w:r>
+        <w:rPr>
+          <w:rFonts w:ascii="Times New Roman" w:eastAsiaTheme="majorEastAsia" w:hAnsi="Times New Roman" w:cs="Times New Roman"/>
+          <w:sz w:val="24"/>
+          <w:szCs w:val="24"/>
+        </w:rPr>
+        <w:t>WallSlideStart, WallSlideEnd</w:t>
+      </w:r>
+    </w:p>
+    <w:p>
+      <w:pPr>
+        <w:ind w:left="720"/>
+        <w:rPr>
+          <w:rFonts w:ascii="Times New Roman" w:eastAsiaTheme="majorEastAsia" w:hAnsi="Times New Roman" w:cs="Times New Roman"/>
+          <w:sz w:val="24"/>
+          <w:szCs w:val="24"/>
+        </w:rPr>
+      </w:pPr>
+    </w:p>
+    <w:p>
+      <w:pPr>
+        <w:pStyle w:val="Heading3"/>
         <w:rPr>
           <w:rStyle w:val="Heading3Char"/>
-          <w:rFonts w:ascii="Times New Roman" w:eastAsiaTheme="minorHAnsi" w:hAnsi="Times New Roman" w:cs="Times New Roman"/>
-          <w:color w:val="auto"/>
-          <w:sz w:val="24"/>
-          <w:szCs w:val="24"/>
-        </w:rPr>
-      </w:pPr>
+          <w:rFonts w:ascii="Times New Roman" w:hAnsi="Times New Roman" w:cs="Times New Roman"/>
+        </w:rPr>
+      </w:pPr>
+      <w:bookmarkStart w:id="15" w:name="_Toc226834701"/>
       <w:r>
         <w:rPr>
           <w:rStyle w:val="Heading3Char"/>
-        </w:rPr>
-        <w:t>Movement states</w:t>
-      </w:r>
-    </w:p>
-    <w:p>
-      <w:pPr>
-        <w:rPr>
-          <w:rFonts w:ascii="Times New Roman" w:hAnsi="Times New Roman" w:cs="Times New Roman"/>
-          <w:sz w:val="24"/>
-          <w:szCs w:val="24"/>
-        </w:rPr>
-      </w:pPr>
-      <w:r>
-        <w:rPr>
-          <w:rFonts w:ascii="Times New Roman" w:hAnsi="Times New Roman" w:cs="Times New Roman"/>
-          <w:sz w:val="24"/>
-          <w:szCs w:val="24"/>
-        </w:rPr>
-        <w:t xml:space="preserve">Idle, Walking, Running, Jumping, Falling, Landing, CrouchIdle, CrouchWalking, Slide, WallSlide, WallJump, Climb </w:t>
-      </w:r>
-    </w:p>
-    <w:p>
-      <w:pPr>
-        <w:pStyle w:val="ListParagraph"/>
-        <w:rPr>
-          <w:rFonts w:ascii="Times New Roman" w:hAnsi="Times New Roman" w:cs="Times New Roman"/>
-          <w:sz w:val="24"/>
-          <w:szCs w:val="24"/>
-        </w:rPr>
-      </w:pPr>
-    </w:p>
-    <w:p>
-      <w:pPr>
-        <w:rPr>
-          <w:rFonts w:ascii="Times New Roman" w:hAnsi="Times New Roman" w:cs="Times New Roman"/>
-          <w:sz w:val="24"/>
-          <w:szCs w:val="24"/>
-        </w:rPr>
-      </w:pPr>
-      <w:r>
-        <w:rPr>
-          <w:rStyle w:val="Heading3Char"/>
-        </w:rPr>
-        <w:t>Transition states</w:t>
-      </w:r>
-      <w:r>
-        <w:rPr>
-          <w:rFonts w:ascii="Times New Roman" w:hAnsi="Times New Roman" w:cs="Times New Roman"/>
-          <w:sz w:val="24"/>
-          <w:szCs w:val="24"/>
-        </w:rPr>
-        <w:t xml:space="preserve"> </w:t>
-      </w:r>
-    </w:p>
-    <w:p>
-      <w:pPr>
-        <w:rPr>
-          <w:rFonts w:ascii="Times New Roman" w:hAnsi="Times New Roman" w:cs="Times New Roman"/>
-          <w:sz w:val="24"/>
-          <w:szCs w:val="24"/>
-        </w:rPr>
-      </w:pPr>
-      <w:r>
-        <w:rPr>
-          <w:rFonts w:ascii="Times New Roman" w:hAnsi="Times New Roman" w:cs="Times New Roman"/>
-          <w:sz w:val="24"/>
-          <w:szCs w:val="24"/>
-        </w:rPr>
-        <w:t xml:space="preserve">IdleToWalk, IdleToCrouch, CrouchToIdle, IdleToJump, RunToSlide, SlideToRun, WallSlideStart, WallSlideEnd </w:t>
-      </w:r>
-    </w:p>
-    <w:p>
-      <w:pPr>
-        <w:rPr>
-          <w:rStyle w:val="Heading3Char"/>
-        </w:rPr>
-      </w:pPr>
-      <w:r>
-        <w:rPr>
-          <w:rStyle w:val="Heading3Char"/>
-        </w:rPr>
+          <w:rFonts w:ascii="Times New Roman" w:hAnsi="Times New Roman" w:cs="Times New Roman"/>
+        </w:rPr>
+        <w:lastRenderedPageBreak/>
         <w:t>Combat states</w:t>
       </w:r>
-    </w:p>
-    <w:p>
-      <w:pPr>
-        <w:rPr>
-          <w:rFonts w:ascii="Times New Roman" w:hAnsi="Times New Roman" w:cs="Times New Roman"/>
-          <w:sz w:val="24"/>
-          <w:szCs w:val="24"/>
-        </w:rPr>
-      </w:pPr>
-      <w:r>
-        <w:rPr>
-          <w:rFonts w:ascii="Times New Roman" w:hAnsi="Times New Roman" w:cs="Times New Roman"/>
-          <w:sz w:val="24"/>
-          <w:szCs w:val="24"/>
-        </w:rPr>
-        <w:t xml:space="preserve"> Punch, </w:t>
-      </w:r>
-      <w:proofErr w:type="spellStart"/>
-      <w:r>
-        <w:rPr>
-          <w:rFonts w:ascii="Times New Roman" w:hAnsi="Times New Roman" w:cs="Times New Roman"/>
-          <w:sz w:val="24"/>
-          <w:szCs w:val="24"/>
-        </w:rPr>
-        <w:t>DropKick</w:t>
-      </w:r>
-      <w:proofErr w:type="spellEnd"/>
-      <w:r>
-        <w:rPr>
-          <w:rFonts w:ascii="Times New Roman" w:hAnsi="Times New Roman" w:cs="Times New Roman"/>
-          <w:sz w:val="24"/>
-          <w:szCs w:val="24"/>
-        </w:rPr>
-        <w:t xml:space="preserve">, Damage, Block, Death </w:t>
-      </w:r>
+      <w:bookmarkEnd w:id="15"/>
     </w:p>
     <w:p>
       <w:pPr>
@@ -3064,20 +4759,279 @@
           <w:ilvl w:val="0"/>
           <w:numId w:val="4"/>
         </w:numPr>
-        <w:rPr>
-          <w:rFonts w:ascii="Times New Roman" w:hAnsi="Times New Roman" w:cs="Times New Roman"/>
-          <w:sz w:val="24"/>
-          <w:szCs w:val="24"/>
-        </w:rPr>
-      </w:pPr>
-      <w:r>
-        <w:rPr>
-          <w:rFonts w:ascii="Times New Roman" w:hAnsi="Times New Roman" w:cs="Times New Roman"/>
-          <w:sz w:val="24"/>
-          <w:szCs w:val="24"/>
-        </w:rPr>
-        <w:t>changeState() resets the frame counter and calls enter() on the new stat</w:t>
-      </w:r>
+        <w:spacing w:before="30" w:after="30" w:line="240" w:lineRule="auto"/>
+        <w:contextualSpacing w:val="0"/>
+        <w:rPr>
+          <w:rFonts w:ascii="Times New Roman" w:hAnsi="Times New Roman" w:cs="Times New Roman"/>
+          <w:sz w:val="24"/>
+          <w:szCs w:val="24"/>
+        </w:rPr>
+      </w:pPr>
+      <w:r>
+        <w:rPr>
+          <w:rFonts w:ascii="Times New Roman" w:hAnsi="Times New Roman" w:cs="Times New Roman"/>
+          <w:sz w:val="24"/>
+          <w:szCs w:val="24"/>
+        </w:rPr>
+        <w:t xml:space="preserve">Punch </w:t>
+      </w:r>
+      <w:r>
+        <w:rPr>
+          <w:rFonts w:ascii="Times New Roman" w:hAnsi="Times New Roman" w:cs="Times New Roman"/>
+          <w:sz w:val="24"/>
+          <w:szCs w:val="24"/>
+        </w:rPr>
+        <w:t>- 7</w:t>
+      </w:r>
+      <w:r>
+        <w:rPr>
+          <w:rFonts w:ascii="Times New Roman" w:hAnsi="Times New Roman" w:cs="Times New Roman"/>
+          <w:sz w:val="24"/>
+          <w:szCs w:val="24"/>
+        </w:rPr>
+        <w:t>-frame animation, sets attacking = false and returns to idle when done</w:t>
+      </w:r>
+    </w:p>
+    <w:p>
+      <w:pPr>
+        <w:pStyle w:val="ListParagraph"/>
+        <w:numPr>
+          <w:ilvl w:val="0"/>
+          <w:numId w:val="4"/>
+        </w:numPr>
+        <w:spacing w:before="30" w:after="30" w:line="240" w:lineRule="auto"/>
+        <w:contextualSpacing w:val="0"/>
+        <w:rPr>
+          <w:rFonts w:ascii="Times New Roman" w:hAnsi="Times New Roman" w:cs="Times New Roman"/>
+          <w:sz w:val="24"/>
+          <w:szCs w:val="24"/>
+        </w:rPr>
+      </w:pPr>
+      <w:r>
+        <w:rPr>
+          <w:rFonts w:ascii="Times New Roman" w:hAnsi="Times New Roman" w:cs="Times New Roman"/>
+          <w:sz w:val="24"/>
+          <w:szCs w:val="24"/>
+        </w:rPr>
+        <w:t xml:space="preserve">DropKick </w:t>
+      </w:r>
+      <w:r>
+        <w:rPr>
+          <w:rFonts w:ascii="Times New Roman" w:hAnsi="Times New Roman" w:cs="Times New Roman"/>
+          <w:sz w:val="24"/>
+          <w:szCs w:val="24"/>
+        </w:rPr>
+        <w:t xml:space="preserve">- </w:t>
+      </w:r>
+      <w:r>
+        <w:rPr>
+          <w:rFonts w:ascii="Times New Roman" w:hAnsi="Times New Roman" w:cs="Times New Roman"/>
+          <w:sz w:val="24"/>
+          <w:szCs w:val="24"/>
+        </w:rPr>
+        <w:t>entity continues moving with gravity during the animation, transitions to slide on landing</w:t>
+      </w:r>
+    </w:p>
+    <w:p>
+      <w:pPr>
+        <w:pStyle w:val="ListParagraph"/>
+        <w:numPr>
+          <w:ilvl w:val="0"/>
+          <w:numId w:val="4"/>
+        </w:numPr>
+        <w:spacing w:before="30" w:after="30" w:line="240" w:lineRule="auto"/>
+        <w:contextualSpacing w:val="0"/>
+        <w:rPr>
+          <w:rFonts w:ascii="Times New Roman" w:hAnsi="Times New Roman" w:cs="Times New Roman"/>
+          <w:sz w:val="24"/>
+          <w:szCs w:val="24"/>
+        </w:rPr>
+      </w:pPr>
+      <w:r>
+        <w:rPr>
+          <w:rFonts w:ascii="Times New Roman" w:hAnsi="Times New Roman" w:cs="Times New Roman"/>
+          <w:sz w:val="24"/>
+          <w:szCs w:val="24"/>
+        </w:rPr>
+        <w:t xml:space="preserve">Damage (SateDamage) </w:t>
+      </w:r>
+      <w:r>
+        <w:rPr>
+          <w:rFonts w:ascii="Times New Roman" w:hAnsi="Times New Roman" w:cs="Times New Roman"/>
+          <w:sz w:val="24"/>
+          <w:szCs w:val="24"/>
+        </w:rPr>
+        <w:t>-</w:t>
+      </w:r>
+      <w:r>
+        <w:rPr>
+          <w:rFonts w:ascii="Times New Roman" w:hAnsi="Times New Roman" w:cs="Times New Roman"/>
+          <w:sz w:val="24"/>
+          <w:szCs w:val="24"/>
+        </w:rPr>
+        <w:t xml:space="preserve"> 8-frame stagger with small knockback in the opposite direction, returns to idle</w:t>
+      </w:r>
+    </w:p>
+    <w:p>
+      <w:pPr>
+        <w:pStyle w:val="ListParagraph"/>
+        <w:numPr>
+          <w:ilvl w:val="0"/>
+          <w:numId w:val="4"/>
+        </w:numPr>
+        <w:spacing w:before="30" w:after="30" w:line="240" w:lineRule="auto"/>
+        <w:contextualSpacing w:val="0"/>
+        <w:rPr>
+          <w:rFonts w:ascii="Times New Roman" w:hAnsi="Times New Roman" w:cs="Times New Roman"/>
+          <w:sz w:val="24"/>
+          <w:szCs w:val="24"/>
+        </w:rPr>
+      </w:pPr>
+      <w:r>
+        <w:rPr>
+          <w:rFonts w:ascii="Times New Roman" w:hAnsi="Times New Roman" w:cs="Times New Roman"/>
+          <w:sz w:val="24"/>
+          <w:szCs w:val="24"/>
+        </w:rPr>
+        <w:t xml:space="preserve">Block (StateBlocking) </w:t>
+      </w:r>
+      <w:r>
+        <w:rPr>
+          <w:rFonts w:ascii="Times New Roman" w:hAnsi="Times New Roman" w:cs="Times New Roman"/>
+          <w:sz w:val="24"/>
+          <w:szCs w:val="24"/>
+        </w:rPr>
+        <w:t>-</w:t>
+      </w:r>
+      <w:r>
+        <w:rPr>
+          <w:rFonts w:ascii="Times New Roman" w:hAnsi="Times New Roman" w:cs="Times New Roman"/>
+          <w:sz w:val="24"/>
+          <w:szCs w:val="24"/>
+        </w:rPr>
+        <w:t xml:space="preserve"> sets canTakeDamage = false while held, returns to idle on button release</w:t>
+      </w:r>
+    </w:p>
+    <w:p>
+      <w:pPr>
+        <w:pStyle w:val="ListParagraph"/>
+        <w:numPr>
+          <w:ilvl w:val="0"/>
+          <w:numId w:val="4"/>
+        </w:numPr>
+        <w:spacing w:before="30" w:after="30" w:line="240" w:lineRule="auto"/>
+        <w:contextualSpacing w:val="0"/>
+        <w:rPr>
+          <w:rFonts w:ascii="Times New Roman" w:hAnsi="Times New Roman" w:cs="Times New Roman"/>
+          <w:sz w:val="24"/>
+          <w:szCs w:val="24"/>
+        </w:rPr>
+      </w:pPr>
+      <w:r>
+        <w:rPr>
+          <w:rFonts w:ascii="Times New Roman" w:hAnsi="Times New Roman" w:cs="Times New Roman"/>
+          <w:sz w:val="24"/>
+          <w:szCs w:val="24"/>
+        </w:rPr>
+        <w:t xml:space="preserve">Death (StateDeath) </w:t>
+      </w:r>
+      <w:r>
+        <w:rPr>
+          <w:rFonts w:ascii="Times New Roman" w:hAnsi="Times New Roman" w:cs="Times New Roman"/>
+          <w:sz w:val="24"/>
+          <w:szCs w:val="24"/>
+        </w:rPr>
+        <w:t>-</w:t>
+      </w:r>
+      <w:r>
+        <w:rPr>
+          <w:rFonts w:ascii="Times New Roman" w:hAnsi="Times New Roman" w:cs="Times New Roman"/>
+          <w:sz w:val="24"/>
+          <w:szCs w:val="24"/>
+        </w:rPr>
+        <w:t xml:space="preserve"> 25-frame animation, sets isDead = true when finished</w:t>
+      </w:r>
+    </w:p>
+    <w:p>
+      <w:pPr>
+        <w:spacing w:before="30" w:after="30" w:line="240" w:lineRule="auto"/>
+        <w:rPr>
+          <w:rFonts w:ascii="Times New Roman" w:hAnsi="Times New Roman" w:cs="Times New Roman"/>
+          <w:sz w:val="24"/>
+          <w:szCs w:val="24"/>
+        </w:rPr>
+      </w:pPr>
+    </w:p>
+    <w:p>
+      <w:pPr>
+        <w:rPr>
+          <w:rFonts w:ascii="Times New Roman" w:hAnsi="Times New Roman" w:cs="Times New Roman"/>
+          <w:sz w:val="24"/>
+          <w:szCs w:val="24"/>
+        </w:rPr>
+      </w:pPr>
+      <w:proofErr w:type="gramStart"/>
+      <w:r>
+        <w:rPr>
+          <w:rFonts w:ascii="Times New Roman" w:hAnsi="Times New Roman" w:cs="Times New Roman"/>
+          <w:sz w:val="24"/>
+          <w:szCs w:val="24"/>
+        </w:rPr>
+        <w:t>changeState(</w:t>
+      </w:r>
+      <w:proofErr w:type="gramEnd"/>
+      <w:r>
+        <w:rPr>
+          <w:rFonts w:ascii="Times New Roman" w:hAnsi="Times New Roman" w:cs="Times New Roman"/>
+          <w:sz w:val="24"/>
+          <w:szCs w:val="24"/>
+        </w:rPr>
+        <w:t xml:space="preserve">) resets the frame counter and calls </w:t>
+      </w:r>
+      <w:proofErr w:type="gramStart"/>
+      <w:r>
+        <w:rPr>
+          <w:rFonts w:ascii="Times New Roman" w:hAnsi="Times New Roman" w:cs="Times New Roman"/>
+          <w:sz w:val="24"/>
+          <w:szCs w:val="24"/>
+        </w:rPr>
+        <w:t>enter(</w:t>
+      </w:r>
+      <w:proofErr w:type="gramEnd"/>
+      <w:r>
+        <w:rPr>
+          <w:rFonts w:ascii="Times New Roman" w:hAnsi="Times New Roman" w:cs="Times New Roman"/>
+          <w:sz w:val="24"/>
+          <w:szCs w:val="24"/>
+        </w:rPr>
+        <w:t>) on the new stat</w:t>
+      </w:r>
+    </w:p>
+    <w:p>
+      <w:pPr>
+        <w:rPr>
+          <w:rFonts w:ascii="Times New Roman" w:hAnsi="Times New Roman" w:cs="Times New Roman"/>
+          <w:sz w:val="24"/>
+          <w:szCs w:val="24"/>
+        </w:rPr>
+      </w:pPr>
+      <w:r>
+        <w:rPr>
+          <w:rFonts w:ascii="Times New Roman" w:hAnsi="Times New Roman" w:cs="Times New Roman"/>
+          <w:sz w:val="24"/>
+          <w:szCs w:val="24"/>
+        </w:rPr>
+        <w:br w:type="page"/>
+      </w:r>
+    </w:p>
+    <w:p>
+      <w:pPr>
+        <w:rPr>
+          <w:rFonts w:ascii="Times New Roman" w:hAnsi="Times New Roman" w:cs="Times New Roman"/>
+          <w:sz w:val="24"/>
+          <w:szCs w:val="24"/>
+        </w:rPr>
+      </w:pPr>
     </w:p>
     <w:p>
       <w:pPr>
@@ -3098,7 +5052,7 @@
           <w:szCs w:val="40"/>
         </w:rPr>
       </w:pPr>
-      <w:bookmarkStart w:id="5" w:name="_Toc226741967"/>
+      <w:bookmarkStart w:id="16" w:name="_Toc226834702"/>
       <w:r>
         <w:rPr>
           <w:rFonts w:ascii="Times New Roman" w:hAnsi="Times New Roman" w:cs="Times New Roman"/>
@@ -3107,7 +5061,7 @@
         </w:rPr>
         <w:t>Platform</w:t>
       </w:r>
-      <w:bookmarkEnd w:id="5"/>
+      <w:bookmarkEnd w:id="16"/>
     </w:p>
     <w:p>
       <w:pPr>
@@ -3155,48 +5109,75 @@
           <w:sz w:val="24"/>
           <w:szCs w:val="24"/>
         </w:rPr>
-        <w:t xml:space="preserve"> </w:t>
-      </w:r>
-    </w:p>
-    <w:p>
-      <w:pPr>
-        <w:rPr>
-          <w:rFonts w:ascii="Times New Roman" w:hAnsi="Times New Roman" w:cs="Times New Roman"/>
-          <w:sz w:val="24"/>
-          <w:szCs w:val="24"/>
-        </w:rPr>
-      </w:pPr>
-      <w:r>
-        <w:rPr>
-          <w:rFonts w:ascii="Times New Roman" w:hAnsi="Times New Roman" w:cs="Times New Roman"/>
-          <w:sz w:val="24"/>
-          <w:szCs w:val="24"/>
-        </w:rPr>
-        <w:t xml:space="preserve">Checks </w:t>
-      </w:r>
-      <w:r>
-        <w:rPr>
-          <w:rFonts w:ascii="Times New Roman" w:hAnsi="Times New Roman" w:cs="Times New Roman"/>
-          <w:sz w:val="24"/>
-          <w:szCs w:val="24"/>
-        </w:rPr>
-        <w:t>AABB collision</w:t>
-      </w:r>
-      <w:r>
-        <w:rPr>
-          <w:rFonts w:ascii="Times New Roman" w:hAnsi="Times New Roman" w:cs="Times New Roman"/>
-          <w:sz w:val="24"/>
-          <w:szCs w:val="24"/>
-        </w:rPr>
-        <w:t xml:space="preserve"> that </w:t>
-      </w:r>
-      <w:r>
-        <w:rPr>
-          <w:rFonts w:ascii="Times New Roman" w:hAnsi="Times New Roman" w:cs="Times New Roman"/>
-          <w:sz w:val="24"/>
-          <w:szCs w:val="24"/>
-        </w:rPr>
-        <w:t>and returns a CollisionType (Top/Bottom/Left/Right)</w:t>
+        <w:t>. Contains a sprite for rendering and a rectangleShape for collisions.</w:t>
+      </w:r>
+    </w:p>
+    <w:p>
+      <w:pPr>
+        <w:rPr>
+          <w:rFonts w:ascii="Times New Roman" w:hAnsi="Times New Roman" w:cs="Times New Roman"/>
+          <w:sz w:val="24"/>
+          <w:szCs w:val="24"/>
+        </w:rPr>
+      </w:pPr>
+      <w:r>
+        <w:rPr>
+          <w:rFonts w:ascii="Times New Roman" w:hAnsi="Times New Roman" w:cs="Times New Roman"/>
+          <w:sz w:val="24"/>
+          <w:szCs w:val="24"/>
+        </w:rPr>
+        <w:t>The size of the collider is set to the size of the texture, ensuring that the collider matches up with the visuals exactly.</w:t>
+      </w:r>
+    </w:p>
+    <w:p>
+      <w:pPr>
+        <w:rPr>
+          <w:rFonts w:ascii="Times New Roman" w:hAnsi="Times New Roman" w:cs="Times New Roman"/>
+          <w:sz w:val="24"/>
+          <w:szCs w:val="24"/>
+        </w:rPr>
+      </w:pPr>
+    </w:p>
+    <w:p>
+      <w:pPr>
+        <w:rPr>
+          <w:rFonts w:ascii="Times New Roman" w:hAnsi="Times New Roman" w:cs="Times New Roman"/>
+          <w:sz w:val="24"/>
+          <w:szCs w:val="24"/>
+        </w:rPr>
+      </w:pPr>
+      <w:r>
+        <w:rPr>
+          <w:rFonts w:ascii="Times New Roman" w:hAnsi="Times New Roman" w:cs="Times New Roman"/>
+          <w:sz w:val="24"/>
+          <w:szCs w:val="24"/>
+        </w:rPr>
+        <w:t>Takes the entity's collider RectangleShape and checks for AABB intersection.</w:t>
+      </w:r>
+      <w:r>
+        <w:rPr>
+          <w:rFonts w:ascii="Times New Roman" w:hAnsi="Times New Roman" w:cs="Times New Roman"/>
+          <w:sz w:val="24"/>
+          <w:szCs w:val="24"/>
+        </w:rPr>
+        <w:t xml:space="preserve"> If there is an intersection it returns a value of Top, left, right or bottom, depending on where the entity landed.</w:t>
+      </w:r>
+    </w:p>
+    <w:p>
+      <w:pPr>
+        <w:rPr>
+          <w:rFonts w:ascii="Times New Roman" w:hAnsi="Times New Roman" w:cs="Times New Roman"/>
+          <w:sz w:val="24"/>
+          <w:szCs w:val="24"/>
+        </w:rPr>
+      </w:pPr>
+      <w:r>
+        <w:rPr>
+          <w:rFonts w:ascii="Times New Roman" w:hAnsi="Times New Roman" w:cs="Times New Roman"/>
+          <w:sz w:val="24"/>
+          <w:szCs w:val="24"/>
+        </w:rPr>
+        <w:br w:type="page"/>
       </w:r>
     </w:p>
     <w:p>
@@ -3217,7 +5198,7 @@
           <w:szCs w:val="40"/>
         </w:rPr>
       </w:pPr>
-      <w:bookmarkStart w:id="6" w:name="_Toc226741968"/>
+      <w:bookmarkStart w:id="17" w:name="_Toc226834703"/>
       <w:r>
         <w:rPr>
           <w:rFonts w:ascii="Times New Roman" w:hAnsi="Times New Roman" w:cs="Times New Roman"/>
@@ -3226,7 +5207,7 @@
         </w:rPr>
         <w:t>Level</w:t>
       </w:r>
-      <w:bookmarkEnd w:id="6"/>
+      <w:bookmarkEnd w:id="17"/>
     </w:p>
     <w:p>
       <w:pPr>
@@ -3267,7 +5248,6 @@
           <w:sz w:val="24"/>
           <w:szCs w:val="24"/>
         </w:rPr>
-        <w:lastRenderedPageBreak/>
         <w:t>Tile type IDs</w:t>
       </w:r>
       <w:r>
@@ -3432,7 +5412,23 @@
           <w:sz w:val="24"/>
           <w:szCs w:val="24"/>
         </w:rPr>
-        <w:t>Handles Collision with entities and determines whether they should be in the climbing or sliding state if they collide on the left or right</w:t>
+        <w:t xml:space="preserve">Handles Collision with entities and determines whether they should be in the climbing or </w:t>
+      </w:r>
+      <w:r>
+        <w:rPr>
+          <w:rFonts w:ascii="Times New Roman" w:hAnsi="Times New Roman" w:cs="Times New Roman"/>
+          <w:sz w:val="24"/>
+          <w:szCs w:val="24"/>
+        </w:rPr>
+        <w:t xml:space="preserve">wall </w:t>
+      </w:r>
+      <w:r>
+        <w:rPr>
+          <w:rFonts w:ascii="Times New Roman" w:hAnsi="Times New Roman" w:cs="Times New Roman"/>
+          <w:sz w:val="24"/>
+          <w:szCs w:val="24"/>
+        </w:rPr>
+        <w:t>sliding state if they collide on the left or right</w:t>
       </w:r>
       <w:r>
         <w:rPr>
@@ -4884,6 +6880,84 @@
     </w:lvl>
   </w:abstractNum>
   <w:abstractNum w:abstractNumId="10" w15:restartNumberingAfterBreak="0">
+    <w:nsid w:val="7AC0772C"/>
+    <w:multiLevelType w:val="hybridMultilevel"/>
+    <w:tmpl w:val="3A5C2FE8"/>
+    <w:lvl w:ilvl="0" w:tplc="2B78FA22">
+      <w:start w:val="1"/>
+      <w:numFmt w:val="bullet"/>
+      <w:lvlText w:val="•"/>
+      <w:lvlJc w:val="left"/>
+      <w:pPr>
+        <w:ind w:left="720" w:hanging="360"/>
+      </w:pPr>
+    </w:lvl>
+    <w:lvl w:ilvl="1" w:tplc="93582164">
+      <w:numFmt w:val="decimal"/>
+      <w:lvlText w:val=""/>
+      <w:lvlJc w:val="left"/>
+      <w:pPr>
+        <w:ind w:left="0" w:firstLine="0"/>
+      </w:pPr>
+    </w:lvl>
+    <w:lvl w:ilvl="2" w:tplc="5DC23082">
+      <w:numFmt w:val="decimal"/>
+      <w:lvlText w:val=""/>
+      <w:lvlJc w:val="left"/>
+      <w:pPr>
+        <w:ind w:left="0" w:firstLine="0"/>
+      </w:pPr>
+    </w:lvl>
+    <w:lvl w:ilvl="3" w:tplc="6596B6E2">
+      <w:numFmt w:val="decimal"/>
+      <w:lvlText w:val=""/>
+      <w:lvlJc w:val="left"/>
+      <w:pPr>
+        <w:ind w:left="0" w:firstLine="0"/>
+      </w:pPr>
+    </w:lvl>
+    <w:lvl w:ilvl="4" w:tplc="A8F67B64">
+      <w:numFmt w:val="decimal"/>
+      <w:lvlText w:val=""/>
+      <w:lvlJc w:val="left"/>
+      <w:pPr>
+        <w:ind w:left="0" w:firstLine="0"/>
+      </w:pPr>
+    </w:lvl>
+    <w:lvl w:ilvl="5" w:tplc="3F6C6D00">
+      <w:numFmt w:val="decimal"/>
+      <w:lvlText w:val=""/>
+      <w:lvlJc w:val="left"/>
+      <w:pPr>
+        <w:ind w:left="0" w:firstLine="0"/>
+      </w:pPr>
+    </w:lvl>
+    <w:lvl w:ilvl="6" w:tplc="05D40864">
+      <w:numFmt w:val="decimal"/>
+      <w:lvlText w:val=""/>
+      <w:lvlJc w:val="left"/>
+      <w:pPr>
+        <w:ind w:left="0" w:firstLine="0"/>
+      </w:pPr>
+    </w:lvl>
+    <w:lvl w:ilvl="7" w:tplc="56A2DDD4">
+      <w:numFmt w:val="decimal"/>
+      <w:lvlText w:val=""/>
+      <w:lvlJc w:val="left"/>
+      <w:pPr>
+        <w:ind w:left="0" w:firstLine="0"/>
+      </w:pPr>
+    </w:lvl>
+    <w:lvl w:ilvl="8" w:tplc="A5CAACC8">
+      <w:numFmt w:val="decimal"/>
+      <w:lvlText w:val=""/>
+      <w:lvlJc w:val="left"/>
+      <w:pPr>
+        <w:ind w:left="0" w:firstLine="0"/>
+      </w:pPr>
+    </w:lvl>
+  </w:abstractNum>
+  <w:abstractNum w:abstractNumId="11" w15:restartNumberingAfterBreak="0">
     <w:nsid w:val="7D8E16DE"/>
     <w:multiLevelType w:val="hybridMultilevel"/>
     <w:tmpl w:val="214A95E2"/>
@@ -5008,7 +7082,7 @@
     <w:abstractNumId w:val="2"/>
   </w:num>
   <w:num w:numId="5" w16cid:durableId="1682203469">
-    <w:abstractNumId w:val="10"/>
+    <w:abstractNumId w:val="11"/>
   </w:num>
   <w:num w:numId="6" w16cid:durableId="1655989540">
     <w:abstractNumId w:val="3"/>
@@ -5027,6 +7101,9 @@
   </w:num>
   <w:num w:numId="11" w16cid:durableId="1064450507">
     <w:abstractNumId w:val="4"/>
+  </w:num>
+  <w:num w:numId="12" w16cid:durableId="78060994">
+    <w:abstractNumId w:val="10"/>
   </w:num>
 </w:numbering>
 </file>
@@ -5633,6 +7710,7 @@
   <w:style w:type="character" w:default="1" w:styleId="DefaultParagraphFont">
     <w:name w:val="Default Paragraph Font"/>
     <w:uiPriority w:val="1"/>
+    <w:semiHidden/>
     <w:unhideWhenUsed/>
   </w:style>
   <w:style w:type="table" w:default="1" w:styleId="TableNormal">
@@ -5999,6 +8077,19 @@
       <w:u w:val="single"/>
     </w:rPr>
   </w:style>
+  <w:style w:type="paragraph" w:styleId="TOC3">
+    <w:name w:val="toc 3"/>
+    <w:basedOn w:val="Normal"/>
+    <w:next w:val="Normal"/>
+    <w:autoRedefine/>
+    <w:uiPriority w:val="39"/>
+    <w:unhideWhenUsed/>
+    <w:rsid w:val="00417D07"/>
+    <w:pPr>
+      <w:spacing w:after="100"/>
+      <w:ind w:left="440"/>
+    </w:pPr>
+  </w:style>
 </w:styles>
 </file>
 

</xml_diff>